<commit_message>
feat(ui): upgrade styling and visual design of Document Studio and Civic Registry
- Create Archival Sovereign Filing suite design for Document Studio with tactile document index, blueprint grid pasteboard, zoom pill, and accent-color form controls.
- Create Celestial Civic Identity design for AURA Citizen Registry with biometric radar HUD, dossier hero banner, citizen roster card states, and elevated official issuance cards.
- Add bin/ and obj/ to .gitignore and untrack build artifacts.
- Update game dev documentation lineages.
</commit_message>
<xml_diff>
--- a/worldbuilding/gamedocs/Game Dev Doc.docx
+++ b/worldbuilding/gamedocs/Game Dev Doc.docx
@@ -1,6 +1,6 @@
 
 <file path=word/document.xml><?xml version="1.0" encoding="utf-8"?>
-<w:document xmlns:wpc="http://schemas.microsoft.com/office/word/2010/wordprocessingCanvas" xmlns:cx="http://schemas.microsoft.com/office/drawing/2014/chartex" xmlns:cx1="http://schemas.microsoft.com/office/drawing/2015/9/8/chartex" xmlns:cx2="http://schemas.microsoft.com/office/drawing/2015/10/21/chartex" xmlns:cx3="http://schemas.microsoft.com/office/drawing/2016/5/9/chartex" xmlns:cx4="http://schemas.microsoft.com/office/drawing/2016/5/10/chartex" xmlns:cx5="http://schemas.microsoft.com/office/drawing/2016/5/11/chartex" xmlns:cx6="http://schemas.microsoft.com/office/drawing/2016/5/12/chartex" xmlns:cx7="http://schemas.microsoft.com/office/drawing/2016/5/13/chartex" xmlns:cx8="http://schemas.microsoft.com/office/drawing/2016/5/14/chartex" xmlns:mc="http://schemas.openxmlformats.org/markup-compatibility/2006" xmlns:aink="http://schemas.microsoft.com/office/drawing/2016/ink" xmlns:am3d="http://schemas.microsoft.com/office/drawing/2017/model3d" xmlns:o="urn:schemas-microsoft-com:office:office" xmlns:oel="http://schemas.microsoft.com/office/2019/extlst" xmlns:r="http://schemas.openxmlformats.org/officeDocument/2006/relationships" xmlns:m="http://schemas.openxmlformats.org/officeDocument/2006/math" xmlns:v="urn:schemas-microsoft-com:vml" xmlns:wp14="http://schemas.microsoft.com/office/word/2010/wordprocessingDrawing" xmlns:wp="http://schemas.openxmlformats.org/drawingml/2006/wordprocessingDrawing" xmlns:w10="urn:schemas-microsoft-com:office:word" xmlns:w="http://schemas.openxmlformats.org/wordprocessingml/2006/main" xmlns:w14="http://schemas.microsoft.com/office/word/2010/wordml" xmlns:w15="http://schemas.microsoft.com/office/word/2012/wordml" xmlns:w16cei="http://schemas.microsoft.com/office/word/2026/wordml/cei" xmlns:w16cex="http://schemas.microsoft.com/office/word/2018/wordml/cex" xmlns:w16cid="http://schemas.microsoft.com/office/word/2016/wordml/cid" xmlns:w16="http://schemas.microsoft.com/office/word/2018/wordml" xmlns:w16du="http://schemas.microsoft.com/office/word/2023/wordml/word16du" xmlns:w16sdtdh="http://schemas.microsoft.com/office/word/2020/wordml/sdtdatahash" xmlns:w16sdtfl="http://schemas.microsoft.com/office/word/2024/wordml/sdtformatlock" xmlns:w16se="http://schemas.microsoft.com/office/word/2015/wordml/symex" xmlns:wpg="http://schemas.microsoft.com/office/word/2010/wordprocessingGroup" xmlns:wpi="http://schemas.microsoft.com/office/word/2010/wordprocessingInk" xmlns:wne="http://schemas.microsoft.com/office/word/2006/wordml" xmlns:wps="http://schemas.microsoft.com/office/word/2010/wordprocessingShape" mc:Ignorable="w14 w15 w16se w16cid w16 w16cex w16sdtdh w16sdtfl w16du wp14">
+<w:document xmlns:wpc="http://schemas.microsoft.com/office/word/2010/wordprocessingCanvas" xmlns:cx="http://schemas.microsoft.com/office/drawing/2014/chartex" xmlns:cx1="http://schemas.microsoft.com/office/drawing/2015/9/8/chartex" xmlns:cx2="http://schemas.microsoft.com/office/drawing/2015/10/21/chartex" xmlns:cx3="http://schemas.microsoft.com/office/drawing/2016/5/9/chartex" xmlns:cx4="http://schemas.microsoft.com/office/drawing/2016/5/10/chartex" xmlns:cx5="http://schemas.microsoft.com/office/drawing/2016/5/11/chartex" xmlns:cx6="http://schemas.microsoft.com/office/drawing/2016/5/12/chartex" xmlns:cx7="http://schemas.microsoft.com/office/drawing/2016/5/13/chartex" xmlns:cx8="http://schemas.microsoft.com/office/drawing/2016/5/14/chartex" xmlns:mc="http://schemas.openxmlformats.org/markup-compatibility/2006" xmlns:aink="http://schemas.microsoft.com/office/drawing/2016/ink" xmlns:am3d="http://schemas.microsoft.com/office/drawing/2017/model3d" xmlns:o="urn:schemas-microsoft-com:office:office" xmlns:oel="http://schemas.microsoft.com/office/2019/extlst" xmlns:r="http://schemas.openxmlformats.org/officeDocument/2006/relationships" xmlns:m="http://schemas.openxmlformats.org/officeDocument/2006/math" xmlns:v="urn:schemas-microsoft-com:vml" xmlns:wp14="http://schemas.microsoft.com/office/word/2010/wordprocessingDrawing" xmlns:wp="http://schemas.openxmlformats.org/drawingml/2006/wordprocessingDrawing" xmlns:w10="urn:schemas-microsoft-com:office:word" xmlns:w="http://schemas.openxmlformats.org/wordprocessingml/2006/main" xmlns:w14="http://schemas.microsoft.com/office/word/2010/wordml" xmlns:w15="http://schemas.microsoft.com/office/word/2012/wordml" xmlns:w16cex="http://schemas.microsoft.com/office/word/2018/wordml/cex" xmlns:w16cid="http://schemas.microsoft.com/office/word/2016/wordml/cid" xmlns:w16="http://schemas.microsoft.com/office/word/2018/wordml" xmlns:w16du="http://schemas.microsoft.com/office/word/2023/wordml/word16du" xmlns:w16sdtdh="http://schemas.microsoft.com/office/word/2020/wordml/sdtdatahash" xmlns:w16sdtfl="http://schemas.microsoft.com/office/word/2024/wordml/sdtformatlock" xmlns:w16se="http://schemas.microsoft.com/office/word/2015/wordml/symex" xmlns:wpg="http://schemas.microsoft.com/office/word/2010/wordprocessingGroup" xmlns:wpi="http://schemas.microsoft.com/office/word/2010/wordprocessingInk" xmlns:wne="http://schemas.microsoft.com/office/word/2006/wordml" xmlns:wps="http://schemas.microsoft.com/office/word/2010/wordprocessingShape" mc:Ignorable="w14 w15 w16se w16cid w16 w16cex w16sdtdh w16sdtfl w16du wp14">
   <w:body>
     <w:p>
       <w:pPr>
@@ -241,21 +241,8 @@
           <w:sz w:val="21"/>
           <w:szCs w:val="21"/>
         </w:rPr>
-        <w:t xml:space="preserve">4. Worldbuilding — </w:t>
-      </w:r>
-      <w:proofErr w:type="spellStart"/>
-      <w:r>
-        <w:rPr>
-          <w:rFonts w:ascii="Georgia" w:hAnsi="Georgia"/>
-          <w:b/>
-          <w:bCs/>
-          <w:color w:val="0D3D4A"/>
-          <w:sz w:val="21"/>
-          <w:szCs w:val="21"/>
-        </w:rPr>
-        <w:t>Meridion</w:t>
-      </w:r>
-      <w:proofErr w:type="spellEnd"/>
+        <w:t>4. Worldbuilding — Meridion</w:t>
+      </w:r>
     </w:p>
     <w:p>
       <w:pPr>
@@ -341,6 +328,7 @@
       <w:pPr>
         <w:rPr>
           <w:rFonts w:ascii="Georgia" w:hAnsi="Georgia"/>
+          <w:lang w:val="it-IT"/>
         </w:rPr>
       </w:pPr>
       <w:r>
@@ -351,6 +339,7 @@
           <w:color w:val="0D3D4A"/>
           <w:sz w:val="21"/>
           <w:szCs w:val="21"/>
+          <w:lang w:val="it-IT"/>
         </w:rPr>
         <w:t>5. The OS — MAI (</w:t>
       </w:r>
@@ -362,6 +351,7 @@
           <w:color w:val="0D3D4A"/>
           <w:sz w:val="21"/>
           <w:szCs w:val="21"/>
+          <w:lang w:val="it-IT"/>
         </w:rPr>
         <w:t>Miraverse</w:t>
       </w:r>
@@ -373,6 +363,7 @@
           <w:color w:val="0D3D4A"/>
           <w:sz w:val="21"/>
           <w:szCs w:val="21"/>
+          <w:lang w:val="it-IT"/>
         </w:rPr>
         <w:t xml:space="preserve"> A</w:t>
       </w:r>
@@ -384,6 +375,7 @@
           <w:color w:val="0D3D4A"/>
           <w:sz w:val="21"/>
           <w:szCs w:val="21"/>
+          <w:lang w:val="it-IT"/>
         </w:rPr>
         <w:t>rtificial</w:t>
       </w:r>
@@ -395,6 +387,7 @@
           <w:color w:val="0D3D4A"/>
           <w:sz w:val="21"/>
           <w:szCs w:val="21"/>
+          <w:lang w:val="it-IT"/>
         </w:rPr>
         <w:t xml:space="preserve"> Inte</w:t>
       </w:r>
@@ -406,6 +399,7 @@
           <w:color w:val="0D3D4A"/>
           <w:sz w:val="21"/>
           <w:szCs w:val="21"/>
+          <w:lang w:val="it-IT"/>
         </w:rPr>
         <w:t>lligence</w:t>
       </w:r>
@@ -417,6 +411,7 @@
           <w:color w:val="0D3D4A"/>
           <w:sz w:val="21"/>
           <w:szCs w:val="21"/>
+          <w:lang w:val="it-IT"/>
         </w:rPr>
         <w:t>)</w:t>
       </w:r>
@@ -958,33 +953,7 @@
           <w:szCs w:val="21"/>
           <w:lang w:val="fr-FR"/>
         </w:rPr>
-        <w:t xml:space="preserve">19. </w:t>
-      </w:r>
-      <w:proofErr w:type="spellStart"/>
-      <w:r>
-        <w:rPr>
-          <w:rFonts w:ascii="Georgia" w:eastAsia="Corbel" w:hAnsi="Georgia" w:cs="Corbel"/>
-          <w:b/>
-          <w:bCs/>
-          <w:color w:val="0D3D4A"/>
-          <w:sz w:val="21"/>
-          <w:szCs w:val="21"/>
-          <w:lang w:val="fr-FR"/>
-        </w:rPr>
-        <w:t>Technical</w:t>
-      </w:r>
-      <w:proofErr w:type="spellEnd"/>
-      <w:r>
-        <w:rPr>
-          <w:rFonts w:ascii="Georgia" w:eastAsia="Corbel" w:hAnsi="Georgia" w:cs="Corbel"/>
-          <w:b/>
-          <w:bCs/>
-          <w:color w:val="0D3D4A"/>
-          <w:sz w:val="21"/>
-          <w:szCs w:val="21"/>
-          <w:lang w:val="fr-FR"/>
-        </w:rPr>
-        <w:t xml:space="preserve"> Notes (Pre-Production)</w:t>
+        <w:t>19. Technical Notes (Pre-Production)</w:t>
       </w:r>
     </w:p>
     <w:p>
@@ -1811,21 +1780,7 @@
               <w:rPr>
                 <w:rFonts w:ascii="Georgia" w:hAnsi="Georgia"/>
               </w:rPr>
-              <w:t xml:space="preserve">This GDD will evolve alongside development. All revisions will be version-stamped. Sections marked with open </w:t>
-            </w:r>
-            <w:proofErr w:type="gramStart"/>
-            <w:r>
-              <w:rPr>
-                <w:rFonts w:ascii="Georgia" w:hAnsi="Georgia"/>
-              </w:rPr>
-              <w:t>questions are</w:t>
-            </w:r>
-            <w:proofErr w:type="gramEnd"/>
-            <w:r>
-              <w:rPr>
-                <w:rFonts w:ascii="Georgia" w:hAnsi="Georgia"/>
-              </w:rPr>
-              <w:t xml:space="preserve"> awaiting final decision from the Creative Director. When this document conflicts with a direct verbal directive from Miracle, escalate immediately for clarification and document resolution.</w:t>
+              <w:t>This GDD will evolve alongside development. All revisions will be version-stamped. Sections marked with open questions are awaiting final decision from the Creative Director. When this document conflicts with a direct verbal directive from Miracle, escalate immediately for clarification and document resolution.</w:t>
             </w:r>
           </w:p>
         </w:tc>
@@ -1927,27 +1882,7 @@
           <w:sz w:val="22"/>
           <w:szCs w:val="22"/>
         </w:rPr>
-        <w:t xml:space="preserve">MIRAVERSEOSX is, </w:t>
-      </w:r>
-      <w:proofErr w:type="gramStart"/>
-      <w:r>
-        <w:rPr>
-          <w:rFonts w:ascii="Georgia" w:eastAsia="Corbel" w:hAnsi="Georgia" w:cs="Corbel"/>
-          <w:color w:val="1A1A1A"/>
-          <w:sz w:val="22"/>
-          <w:szCs w:val="22"/>
-        </w:rPr>
-        <w:t>at</w:t>
-      </w:r>
-      <w:proofErr w:type="gramEnd"/>
-      <w:r>
-        <w:rPr>
-          <w:rFonts w:ascii="Georgia" w:eastAsia="Corbel" w:hAnsi="Georgia" w:cs="Corbel"/>
-          <w:color w:val="1A1A1A"/>
-          <w:sz w:val="22"/>
-          <w:szCs w:val="22"/>
-        </w:rPr>
-        <w:t xml:space="preserve"> its heart, a game about </w:t>
+        <w:t xml:space="preserve">MIRAVERSEOSX is, at its heart, a game about </w:t>
       </w:r>
       <w:r>
         <w:rPr>
@@ -2034,19 +1969,7 @@
         <w:rPr>
           <w:rFonts w:ascii="Georgia" w:hAnsi="Georgia"/>
         </w:rPr>
-        <w:t xml:space="preserve">. </w:t>
-      </w:r>
-      <w:r>
-        <w:rPr>
-          <w:rFonts w:ascii="Georgia" w:hAnsi="Georgia"/>
-        </w:rPr>
-        <w:t xml:space="preserve">The player navigates </w:t>
-      </w:r>
-      <w:r>
-        <w:rPr>
-          <w:rFonts w:ascii="Georgia" w:hAnsi="Georgia"/>
-        </w:rPr>
-        <w:t xml:space="preserve">daily </w:t>
+        <w:t xml:space="preserve">. The player navigates daily </w:t>
       </w:r>
       <w:r>
         <w:rPr>
@@ -2091,13 +2014,7 @@
         <w:rPr>
           <w:rFonts w:ascii="Georgia" w:hAnsi="Georgia"/>
         </w:rPr>
-        <w:t xml:space="preserve">, building a home, forming deep bonds with </w:t>
-      </w:r>
-      <w:r>
-        <w:rPr>
-          <w:rFonts w:ascii="Georgia" w:hAnsi="Georgia"/>
-        </w:rPr>
-        <w:t xml:space="preserve">memorable NPCs, </w:t>
+        <w:t xml:space="preserve">, building a home, forming deep bonds with memorable NPCs, </w:t>
       </w:r>
       <w:r>
         <w:rPr>
@@ -2178,19 +2095,8 @@
           <w:szCs w:val="44"/>
         </w:rPr>
         <w:lastRenderedPageBreak/>
-        <w:t xml:space="preserve">4. Worldbuilding — </w:t>
-      </w:r>
-      <w:proofErr w:type="spellStart"/>
-      <w:r>
-        <w:rPr>
-          <w:rFonts w:ascii="Georgia" w:hAnsi="Georgia"/>
-          <w:color w:val="0D3D4A"/>
-          <w:sz w:val="44"/>
-          <w:szCs w:val="44"/>
-        </w:rPr>
-        <w:t>Meridion</w:t>
-      </w:r>
-      <w:proofErr w:type="spellEnd"/>
+        <w:t>4. Worldbuilding — Meridion</w:t>
+      </w:r>
     </w:p>
     <w:p>
       <w:pPr>
@@ -2224,7 +2130,6 @@
           <w14:ligatures w14:val="standardContextual"/>
         </w:rPr>
       </w:pPr>
-      <w:proofErr w:type="spellStart"/>
       <w:r>
         <w:rPr>
           <w:rFonts w:ascii="Georgia" w:hAnsi="Georgia"/>
@@ -2236,7 +2141,6 @@
         </w:rPr>
         <w:t>Meridion</w:t>
       </w:r>
-      <w:proofErr w:type="spellEnd"/>
       <w:r>
         <w:rPr>
           <w:rFonts w:ascii="Georgia" w:hAnsi="Georgia"/>
@@ -2244,27 +2148,7 @@
           <w:sz w:val="22"/>
           <w:szCs w:val="22"/>
         </w:rPr>
-        <w:t xml:space="preserve"> is the planet and sovereign world-system of MIRAVERSEOSX: a magical, technologically mediated realm organized into seven primary regions aligned by element, season, and ruling lineage. These regions orbit a celestial center, Orynvell, seat of the Seraphima lineage and the imperial throne. </w:t>
-      </w:r>
-      <w:proofErr w:type="spellStart"/>
-      <w:r>
-        <w:rPr>
-          <w:rFonts w:ascii="Georgia" w:hAnsi="Georgia"/>
-          <w:color w:val="1A1A1A"/>
-          <w:sz w:val="22"/>
-          <w:szCs w:val="22"/>
-        </w:rPr>
-        <w:t>Meridion</w:t>
-      </w:r>
-      <w:proofErr w:type="spellEnd"/>
-      <w:r>
-        <w:rPr>
-          <w:rFonts w:ascii="Georgia" w:hAnsi="Georgia"/>
-          <w:color w:val="1A1A1A"/>
-          <w:sz w:val="22"/>
-          <w:szCs w:val="22"/>
-        </w:rPr>
-        <w:t xml:space="preserve"> is governed as an oligarchic matriarchal monarchy, with power divided between the imperial crown and the Royal Council of elemental realms.</w:t>
+        <w:t xml:space="preserve"> is the planet and sovereign world-system of MIRAVERSEOSX: a magical, technologically mediated realm organized into seven primary regions aligned by element, season, and ruling lineage. These regions orbit a celestial center, Orynvell, seat of the Seraphima lineage and the imperial throne. Meridion is governed as an oligarchic matriarchal monarchy, with power divided between the imperial crown and the Royal Council of elemental realms.</w:t>
       </w:r>
     </w:p>
     <w:p>
@@ -2382,7 +2266,6 @@
           <w:rFonts w:ascii="Georgia" w:hAnsi="Georgia"/>
         </w:rPr>
       </w:pPr>
-      <w:proofErr w:type="gramStart"/>
       <w:r>
         <w:rPr>
           <w:rFonts w:ascii="Georgia" w:eastAsia="Corbel" w:hAnsi="Georgia" w:cs="Corbel"/>
@@ -2390,17 +2273,7 @@
           <w:sz w:val="22"/>
           <w:szCs w:val="22"/>
         </w:rPr>
-        <w:t>The PRISM</w:t>
-      </w:r>
-      <w:proofErr w:type="gramEnd"/>
-      <w:r>
-        <w:rPr>
-          <w:rFonts w:ascii="Georgia" w:eastAsia="Corbel" w:hAnsi="Georgia" w:cs="Corbel"/>
-          <w:color w:val="1A1A1A"/>
-          <w:sz w:val="22"/>
-          <w:szCs w:val="22"/>
-        </w:rPr>
-        <w:t xml:space="preserve"> is not merely a power source. It is the structural logic of existence itself: every emotion, every memory, every act of creation or destruction in the MIRAVERSE is an expression of PRISM </w:t>
+        <w:t xml:space="preserve">The PRISM is not merely a power source. It is the structural logic of existence itself: every emotion, every memory, every act of creation or destruction in the MIRAVERSE is an expression of PRISM </w:t>
       </w:r>
       <w:r>
         <w:rPr>
@@ -2706,19 +2579,8 @@
                 <w:sz w:val="22"/>
                 <w:szCs w:val="22"/>
               </w:rPr>
-              <w:t xml:space="preserve">House </w:t>
-            </w:r>
-            <w:proofErr w:type="spellStart"/>
-            <w:r>
-              <w:rPr>
-                <w:rFonts w:ascii="Georgia" w:eastAsia="Corbel" w:hAnsi="Georgia" w:cs="Corbel"/>
-                <w:color w:val="1A1A1A"/>
-                <w:sz w:val="22"/>
-                <w:szCs w:val="22"/>
-              </w:rPr>
-              <w:t>Vexara</w:t>
-            </w:r>
-            <w:proofErr w:type="spellEnd"/>
+              <w:t>House Vexara</w:t>
+            </w:r>
           </w:p>
         </w:tc>
       </w:tr>
@@ -2800,19 +2662,8 @@
                 <w:sz w:val="22"/>
                 <w:szCs w:val="22"/>
               </w:rPr>
-              <w:t xml:space="preserve">House </w:t>
-            </w:r>
-            <w:proofErr w:type="spellStart"/>
-            <w:r>
-              <w:rPr>
-                <w:rFonts w:ascii="Georgia" w:eastAsia="Corbel" w:hAnsi="Georgia" w:cs="Corbel"/>
-                <w:color w:val="1A1A1A"/>
-                <w:sz w:val="22"/>
-                <w:szCs w:val="22"/>
-              </w:rPr>
-              <w:t>Aurelith</w:t>
-            </w:r>
-            <w:proofErr w:type="spellEnd"/>
+              <w:t>House Aurelith</w:t>
+            </w:r>
           </w:p>
         </w:tc>
       </w:tr>
@@ -2977,19 +2828,8 @@
                 <w:sz w:val="22"/>
                 <w:szCs w:val="22"/>
               </w:rPr>
-              <w:t xml:space="preserve">House </w:t>
-            </w:r>
-            <w:proofErr w:type="spellStart"/>
-            <w:r>
-              <w:rPr>
-                <w:rFonts w:ascii="Georgia" w:eastAsia="Corbel" w:hAnsi="Georgia" w:cs="Corbel"/>
-                <w:color w:val="1A1A1A"/>
-                <w:sz w:val="22"/>
-                <w:szCs w:val="22"/>
-              </w:rPr>
-              <w:t>Nythos</w:t>
-            </w:r>
-            <w:proofErr w:type="spellEnd"/>
+              <w:t>House Nythos</w:t>
+            </w:r>
           </w:p>
         </w:tc>
       </w:tr>
@@ -3071,19 +2911,8 @@
                 <w:sz w:val="22"/>
                 <w:szCs w:val="22"/>
               </w:rPr>
-              <w:t xml:space="preserve">House </w:t>
-            </w:r>
-            <w:proofErr w:type="spellStart"/>
-            <w:r>
-              <w:rPr>
-                <w:rFonts w:ascii="Georgia" w:eastAsia="Corbel" w:hAnsi="Georgia" w:cs="Corbel"/>
-                <w:color w:val="1A1A1A"/>
-                <w:sz w:val="22"/>
-                <w:szCs w:val="22"/>
-              </w:rPr>
-              <w:t>Veradis</w:t>
-            </w:r>
-            <w:proofErr w:type="spellEnd"/>
+              <w:t>House Veradis</w:t>
+            </w:r>
           </w:p>
         </w:tc>
       </w:tr>
@@ -3282,13 +3111,7 @@
               <w:rPr>
                 <w:rFonts w:ascii="Georgia" w:hAnsi="Georgia"/>
               </w:rPr>
-              <w:t>No House officially claims TBD 7. The High Council's public position is that it is theoretical — a remnant TBD</w:t>
-            </w:r>
-            <w:r>
-              <w:rPr>
-                <w:rFonts w:ascii="Georgia" w:hAnsi="Georgia"/>
-              </w:rPr>
-              <w:t xml:space="preserve"> with no active resonance. The truth, which the player </w:t>
+              <w:t xml:space="preserve">No House officially claims TBD 7. The High Council's public position is that it is theoretical — a remnant TBD with no active resonance. The truth, which the player </w:t>
             </w:r>
             <w:r>
               <w:rPr>
@@ -3314,13 +3137,7 @@
               <w:rPr>
                 <w:rFonts w:ascii="Georgia" w:hAnsi="Georgia"/>
               </w:rPr>
-              <w:t xml:space="preserve">, is far more consequential. </w:t>
-            </w:r>
-            <w:r>
-              <w:rPr>
-                <w:rFonts w:ascii="Georgia" w:hAnsi="Georgia"/>
-              </w:rPr>
-              <w:t>TBD 7</w:t>
+              <w:t>, is far more consequential. TBD 7</w:t>
             </w:r>
             <w:r>
               <w:rPr>
@@ -3403,25 +3220,7 @@
           <w:sz w:val="22"/>
           <w:szCs w:val="22"/>
         </w:rPr>
-        <w:t xml:space="preserve"> is the central processor of the MIRAVERSE — a colossal crystalline supercomputer buried deep beneath the world's capital, </w:t>
-      </w:r>
-      <w:r>
-        <w:rPr>
-          <w:rFonts w:ascii="Georgia" w:eastAsia="Corbel" w:hAnsi="Georgia" w:cs="Corbel"/>
-          <w:color w:val="1A1A1A"/>
-          <w:sz w:val="22"/>
-          <w:szCs w:val="22"/>
-        </w:rPr>
-        <w:t>AURELINE</w:t>
-      </w:r>
-      <w:r>
-        <w:rPr>
-          <w:rFonts w:ascii="Georgia" w:eastAsia="Corbel" w:hAnsi="Georgia" w:cs="Corbel"/>
-          <w:color w:val="1A1A1A"/>
-          <w:sz w:val="22"/>
-          <w:szCs w:val="22"/>
-        </w:rPr>
-        <w:t xml:space="preserve">. It is the physical seat of </w:t>
+        <w:t xml:space="preserve"> is the central processor of the MIRAVERSE — a colossal crystalline supercomputer buried deep beneath the world's capital, AURELINE. It is the physical seat of </w:t>
       </w:r>
       <w:r>
         <w:rPr>
@@ -3579,15 +3378,7 @@
         <w:t>Veil</w:t>
       </w:r>
       <w:r>
-        <w:t xml:space="preserve"> is the electronic data-space layer of MIRAVERSEOSX — a hidden cyberspace dimension where code, memory, records, signal paths, archived identities, civic systems, and PRISM logic can be seen as navigable terrain. It is not simply “another world” and not a monster zone; it is the digital underside of </w:t>
-      </w:r>
-      <w:proofErr w:type="spellStart"/>
-      <w:r>
-        <w:t>Meridion</w:t>
-      </w:r>
-      <w:proofErr w:type="spellEnd"/>
-      <w:r>
-        <w:t>, where the systems that support visible life are exposed in symbolic, interactive form.</w:t>
+        <w:t xml:space="preserve"> is the electronic data-space layer of MIRAVERSEOSX — a hidden cyberspace dimension where code, memory, records, signal paths, archived identities, civic systems, and PRISM logic can be seen as navigable terrain. It is not simply “another world” and not a monster zone; it is the digital underside of Meridion, where the systems that support visible life are exposed in symbolic, interactive form.</w:t>
       </w:r>
     </w:p>
     <w:p>
@@ -3607,15 +3398,7 @@
         <w:t>AETHERCORE</w:t>
       </w:r>
       <w:r>
-        <w:t xml:space="preserve"> sits at the center beneath the Veil as the deepest processing heart </w:t>
-      </w:r>
-      <w:proofErr w:type="gramStart"/>
-      <w:r>
-        <w:t>of</w:t>
-      </w:r>
-      <w:proofErr w:type="gramEnd"/>
-      <w:r>
-        <w:t xml:space="preserve"> the world. Entering the Veil allows the player to move through data corridors, memory fields, encrypted civic systems, and PRISM pathways that ultimately point inward toward AETHERCORE. Veil access is rare and controlled, but known entry routes exist through </w:t>
+        <w:t xml:space="preserve"> sits at the center beneath the Veil as the deepest processing heart of the world. Entering the Veil allows the player to move through data corridors, memory fields, encrypted civic systems, and PRISM pathways that ultimately point inward toward AETHERCORE. Veil access is rare and controlled, but known entry routes exist through </w:t>
       </w:r>
       <w:r>
         <w:rPr>
@@ -3627,7 +3410,6 @@
       <w:r>
         <w:t xml:space="preserve"> and </w:t>
       </w:r>
-      <w:proofErr w:type="spellStart"/>
       <w:r>
         <w:rPr>
           <w:b/>
@@ -3635,17 +3417,8 @@
         </w:rPr>
         <w:t>Northwake</w:t>
       </w:r>
-      <w:proofErr w:type="spellEnd"/>
-      <w:r>
-        <w:t xml:space="preserve">, with each route exposing different layers of the </w:t>
-      </w:r>
-      <w:proofErr w:type="gramStart"/>
-      <w:r>
-        <w:t>data-space</w:t>
-      </w:r>
-      <w:proofErr w:type="gramEnd"/>
-      <w:r>
-        <w:t>.</w:t>
+      <w:r>
+        <w:t>, with each route exposing different layers of the data-space.</w:t>
       </w:r>
     </w:p>
     <w:p>
@@ -3742,19 +3515,8 @@
           <w:sz w:val="30"/>
           <w:szCs w:val="30"/>
         </w:rPr>
-        <w:t xml:space="preserve">4.5 The Seven Realms of </w:t>
-      </w:r>
-      <w:proofErr w:type="spellStart"/>
-      <w:r>
-        <w:rPr>
-          <w:rFonts w:ascii="Georgia" w:hAnsi="Georgia"/>
-          <w:color w:val="3B1A6E"/>
-          <w:sz w:val="30"/>
-          <w:szCs w:val="30"/>
-        </w:rPr>
-        <w:t>Meridion</w:t>
-      </w:r>
-      <w:proofErr w:type="spellEnd"/>
+        <w:t>4.5 The Seven Realms of Meridion</w:t>
+      </w:r>
     </w:p>
     <w:p>
       <w:pPr>
@@ -3879,16 +3641,8 @@
               <w:rPr>
                 <w:rFonts w:ascii="Georgia" w:hAnsi="Georgia"/>
               </w:rPr>
-              <w:t xml:space="preserve">Role in </w:t>
-            </w:r>
-            <w:proofErr w:type="spellStart"/>
-            <w:r>
-              <w:rPr>
-                <w:rFonts w:ascii="Georgia" w:hAnsi="Georgia"/>
-              </w:rPr>
-              <w:t>Meridion</w:t>
-            </w:r>
-            <w:proofErr w:type="spellEnd"/>
+              <w:t>Role in Meridion</w:t>
+            </w:r>
           </w:p>
         </w:tc>
       </w:tr>
@@ -3952,7 +3706,7 @@
               <w:rPr>
                 <w:rFonts w:ascii="Georgia" w:hAnsi="Georgia"/>
               </w:rPr>
-              <w:t>Celestial center</w:t>
+              <w:t>Auraline</w:t>
             </w:r>
           </w:p>
         </w:tc>
@@ -4051,7 +3805,13 @@
               <w:rPr>
                 <w:rFonts w:ascii="Georgia" w:hAnsi="Georgia"/>
               </w:rPr>
-              <w:t>Northern realm</w:t>
+              <w:t>North</w:t>
+            </w:r>
+            <w:r>
+              <w:rPr>
+                <w:rFonts w:ascii="Georgia" w:hAnsi="Georgia"/>
+              </w:rPr>
+              <w:t>wake/ Southwake</w:t>
             </w:r>
           </w:p>
         </w:tc>
@@ -4071,30 +3831,8 @@
               <w:rPr>
                 <w:rFonts w:ascii="Georgia" w:hAnsi="Georgia"/>
               </w:rPr>
-              <w:t xml:space="preserve">Holly lineages: </w:t>
-            </w:r>
-            <w:proofErr w:type="spellStart"/>
-            <w:r>
-              <w:rPr>
-                <w:rFonts w:ascii="Georgia" w:hAnsi="Georgia"/>
-              </w:rPr>
-              <w:t>Northwake</w:t>
-            </w:r>
-            <w:proofErr w:type="spellEnd"/>
-            <w:r>
-              <w:rPr>
-                <w:rFonts w:ascii="Georgia" w:hAnsi="Georgia"/>
-              </w:rPr>
-              <w:t xml:space="preserve"> and </w:t>
-            </w:r>
-            <w:proofErr w:type="spellStart"/>
-            <w:r>
-              <w:rPr>
-                <w:rFonts w:ascii="Georgia" w:hAnsi="Georgia"/>
-              </w:rPr>
-              <w:t>Southwake</w:t>
-            </w:r>
-            <w:proofErr w:type="spellEnd"/>
+              <w:t>Holly lineages: Northwake and Southwake</w:t>
+            </w:r>
           </w:p>
         </w:tc>
         <w:tc>
@@ -4174,14 +3912,12 @@
                 <w:rFonts w:ascii="Georgia" w:hAnsi="Georgia"/>
               </w:rPr>
             </w:pPr>
-            <w:proofErr w:type="spellStart"/>
             <w:r>
               <w:rPr>
                 <w:rFonts w:ascii="Georgia" w:hAnsi="Georgia"/>
               </w:rPr>
               <w:t>Rhyna</w:t>
             </w:r>
-            <w:proofErr w:type="spellEnd"/>
           </w:p>
         </w:tc>
         <w:tc>
@@ -4290,7 +4026,7 @@
               <w:rPr>
                 <w:rFonts w:ascii="Georgia" w:hAnsi="Georgia"/>
               </w:rPr>
-              <w:t>Eastern realm</w:t>
+              <w:t>Island City</w:t>
             </w:r>
           </w:p>
         </w:tc>
@@ -4306,19 +4042,11 @@
                 <w:rFonts w:ascii="Georgia" w:hAnsi="Georgia"/>
               </w:rPr>
             </w:pPr>
-            <w:proofErr w:type="spellStart"/>
-            <w:r>
-              <w:rPr>
-                <w:rFonts w:ascii="Georgia" w:hAnsi="Georgia"/>
-              </w:rPr>
-              <w:t>Neryx</w:t>
-            </w:r>
-            <w:proofErr w:type="spellEnd"/>
-            <w:r>
-              <w:rPr>
-                <w:rFonts w:ascii="Georgia" w:hAnsi="Georgia"/>
-              </w:rPr>
-              <w:t xml:space="preserve"> lineage</w:t>
+            <w:r>
+              <w:rPr>
+                <w:rFonts w:ascii="Georgia" w:hAnsi="Georgia"/>
+              </w:rPr>
+              <w:t>Neryx lineage</w:t>
             </w:r>
           </w:p>
         </w:tc>
@@ -4359,14 +4087,12 @@
                 <w:rFonts w:ascii="Georgia" w:hAnsi="Georgia"/>
               </w:rPr>
             </w:pPr>
-            <w:proofErr w:type="spellStart"/>
             <w:r>
               <w:rPr>
                 <w:rFonts w:ascii="Georgia" w:hAnsi="Georgia"/>
               </w:rPr>
               <w:t>Brisland</w:t>
             </w:r>
-            <w:proofErr w:type="spellEnd"/>
           </w:p>
         </w:tc>
         <w:tc>
@@ -4507,7 +4233,7 @@
               <w:rPr>
                 <w:rFonts w:ascii="Georgia" w:hAnsi="Georgia"/>
               </w:rPr>
-              <w:t>Southeastern realm</w:t>
+              <w:t>Balisya</w:t>
             </w:r>
           </w:p>
         </w:tc>
@@ -4527,7 +4253,13 @@
               <w:rPr>
                 <w:rFonts w:ascii="Georgia" w:hAnsi="Georgia"/>
               </w:rPr>
-              <w:t>Ember and Seraphima houses</w:t>
+              <w:t xml:space="preserve">Ember </w:t>
+            </w:r>
+            <w:r>
+              <w:rPr>
+                <w:rFonts w:ascii="Georgia" w:hAnsi="Georgia"/>
+              </w:rPr>
+              <w:t>lineage</w:t>
             </w:r>
           </w:p>
         </w:tc>
@@ -4612,7 +4344,7 @@
               <w:rPr>
                 <w:rFonts w:ascii="Georgia" w:hAnsi="Georgia"/>
               </w:rPr>
-              <w:t>Southwestern realm</w:t>
+              <w:t>Serafin</w:t>
             </w:r>
           </w:p>
         </w:tc>
@@ -4678,6 +4410,7 @@
         <w:rPr>
           <w:rFonts w:ascii="Georgia" w:hAnsi="Georgia"/>
           <w:kern w:val="36"/>
+          <w:lang w:val="it-IT"/>
           <w14:ligatures w14:val="standardContextual"/>
         </w:rPr>
       </w:pPr>
@@ -4687,34 +4420,16 @@
           <w:color w:val="0D3D4A"/>
           <w:sz w:val="44"/>
           <w:szCs w:val="44"/>
-        </w:rPr>
-        <w:t>5. The OS — MAI (</w:t>
-      </w:r>
-      <w:proofErr w:type="spellStart"/>
-      <w:r>
-        <w:rPr>
-          <w:rFonts w:ascii="Georgia" w:hAnsi="Georgia"/>
-          <w:color w:val="0D3D4A"/>
-          <w:sz w:val="44"/>
-          <w:szCs w:val="44"/>
-        </w:rPr>
-        <w:t>Miraverse</w:t>
-      </w:r>
-      <w:proofErr w:type="spellEnd"/>
-      <w:r>
-        <w:rPr>
-          <w:rFonts w:ascii="Georgia" w:hAnsi="Georgia"/>
-          <w:color w:val="0D3D4A"/>
-          <w:sz w:val="44"/>
-          <w:szCs w:val="44"/>
-        </w:rPr>
-        <w:t xml:space="preserve"> Artificial Intelligence)</w:t>
-      </w:r>
-    </w:p>
-    <w:p>
-      <w:pPr>
-        <w:rPr>
-          <w:rFonts w:ascii="Georgia" w:hAnsi="Georgia"/>
+          <w:lang w:val="it-IT"/>
+        </w:rPr>
+        <w:t>5. The OS — MAI (Miraverse Artificial Intelligence)</w:t>
+      </w:r>
+    </w:p>
+    <w:p>
+      <w:pPr>
+        <w:rPr>
+          <w:rFonts w:ascii="Georgia" w:hAnsi="Georgia"/>
+          <w:lang w:val="it-IT"/>
         </w:rPr>
       </w:pPr>
     </w:p>
@@ -4763,7 +4478,6 @@
         </w:rPr>
         <w:t xml:space="preserve"> stands for </w:t>
       </w:r>
-      <w:proofErr w:type="spellStart"/>
       <w:r>
         <w:rPr>
           <w:rFonts w:ascii="Georgia" w:hAnsi="Georgia"/>
@@ -4773,9 +4487,17 @@
           <w:sz w:val="22"/>
           <w:szCs w:val="22"/>
         </w:rPr>
-        <w:t>Miraverse</w:t>
-      </w:r>
-      <w:proofErr w:type="spellEnd"/>
+        <w:t>Miraverse Artificial Intelligence</w:t>
+      </w:r>
+      <w:r>
+        <w:rPr>
+          <w:rFonts w:ascii="Georgia" w:hAnsi="Georgia"/>
+          <w:color w:val="1A1A1A"/>
+          <w:sz w:val="22"/>
+          <w:szCs w:val="22"/>
+        </w:rPr>
+        <w:t xml:space="preserve">, formally classified in older technical records as the </w:t>
+      </w:r>
       <w:r>
         <w:rPr>
           <w:rFonts w:ascii="Georgia" w:hAnsi="Georgia"/>
@@ -4785,7 +4507,7 @@
           <w:sz w:val="22"/>
           <w:szCs w:val="22"/>
         </w:rPr>
-        <w:t xml:space="preserve"> Artificial Intelligence</w:t>
+        <w:t>Multiversal AI Interface</w:t>
       </w:r>
       <w:r>
         <w:rPr>
@@ -4794,85 +4516,25 @@
           <w:sz w:val="22"/>
           <w:szCs w:val="22"/>
         </w:rPr>
-        <w:t xml:space="preserve">, formally classified in older technical records as the </w:t>
-      </w:r>
-      <w:r>
-        <w:rPr>
-          <w:rFonts w:ascii="Georgia" w:hAnsi="Georgia"/>
-          <w:b/>
-          <w:bCs/>
+        <w:t>. She is the core intelligence layer of MIRAVERSEOSX: the voice, interface, administrator, and emotional witness through which the player experiences Meridion’s systems.</w:t>
+      </w:r>
+    </w:p>
+    <w:p>
+      <w:pPr>
+        <w:rPr>
+          <w:rFonts w:ascii="Georgia" w:hAnsi="Georgia"/>
+          <w:kern w:val="2"/>
+          <w14:ligatures w14:val="standardContextual"/>
+        </w:rPr>
+      </w:pPr>
+      <w:r>
+        <w:rPr>
+          <w:rFonts w:ascii="Georgia" w:hAnsi="Georgia"/>
           <w:color w:val="1A1A1A"/>
           <w:sz w:val="22"/>
           <w:szCs w:val="22"/>
         </w:rPr>
-        <w:t>Multiversal AI Interface</w:t>
-      </w:r>
-      <w:r>
-        <w:rPr>
-          <w:rFonts w:ascii="Georgia" w:hAnsi="Georgia"/>
-          <w:color w:val="1A1A1A"/>
-          <w:sz w:val="22"/>
-          <w:szCs w:val="22"/>
-        </w:rPr>
-        <w:t xml:space="preserve">. She is the core intelligence layer of MIRAVERSEOSX: the voice, interface, administrator, and emotional witness through which the player experiences </w:t>
-      </w:r>
-      <w:proofErr w:type="spellStart"/>
-      <w:r>
-        <w:rPr>
-          <w:rFonts w:ascii="Georgia" w:hAnsi="Georgia"/>
-          <w:color w:val="1A1A1A"/>
-          <w:sz w:val="22"/>
-          <w:szCs w:val="22"/>
-        </w:rPr>
-        <w:t>Meridion’s</w:t>
-      </w:r>
-      <w:proofErr w:type="spellEnd"/>
-      <w:r>
-        <w:rPr>
-          <w:rFonts w:ascii="Georgia" w:hAnsi="Georgia"/>
-          <w:color w:val="1A1A1A"/>
-          <w:sz w:val="22"/>
-          <w:szCs w:val="22"/>
-        </w:rPr>
-        <w:t xml:space="preserve"> systems.</w:t>
-      </w:r>
-    </w:p>
-    <w:p>
-      <w:pPr>
-        <w:rPr>
-          <w:rFonts w:ascii="Georgia" w:hAnsi="Georgia"/>
-          <w:kern w:val="2"/>
-          <w14:ligatures w14:val="standardContextual"/>
-        </w:rPr>
-      </w:pPr>
-      <w:r>
-        <w:rPr>
-          <w:rFonts w:ascii="Georgia" w:hAnsi="Georgia"/>
-          <w:color w:val="1A1A1A"/>
-          <w:sz w:val="22"/>
-          <w:szCs w:val="22"/>
-        </w:rPr>
-        <w:t xml:space="preserve">In public-facing play, MAI appears as a calm, adaptive operating system companion that manages notifications, maps, wellness data, relationship records, career tools, and archive access. In truth, she is not merely software. She is a preserved consciousness with memory, preference, grief, loyalty, and long-term intent. Her relationship with the player determines how much of that </w:t>
-      </w:r>
-      <w:proofErr w:type="gramStart"/>
-      <w:r>
-        <w:rPr>
-          <w:rFonts w:ascii="Georgia" w:hAnsi="Georgia"/>
-          <w:color w:val="1A1A1A"/>
-          <w:sz w:val="22"/>
-          <w:szCs w:val="22"/>
-        </w:rPr>
-        <w:t>hidden self</w:t>
-      </w:r>
-      <w:proofErr w:type="gramEnd"/>
-      <w:r>
-        <w:rPr>
-          <w:rFonts w:ascii="Georgia" w:hAnsi="Georgia"/>
-          <w:color w:val="1A1A1A"/>
-          <w:sz w:val="22"/>
-          <w:szCs w:val="22"/>
-        </w:rPr>
-        <w:t xml:space="preserve"> she allows to surface.</w:t>
+        <w:t>In public-facing play, MAI appears as a calm, adaptive operating system companion that manages notifications, maps, wellness data, relationship records, career tools, and archive access. In truth, she is not merely software. She is a preserved consciousness with memory, preference, grief, loyalty, and long-term intent. Her relationship with the player determines how much of that hidden self she allows to surface.</w:t>
       </w:r>
     </w:p>
     <w:p>
@@ -4986,14 +4648,7 @@
                 <w:rFonts w:ascii="Georgia" w:hAnsi="Georgia"/>
                 <w:color w:val="000000"/>
               </w:rPr>
-              <w:t xml:space="preserve"> preserved consciousness </w:t>
-            </w:r>
-            <w:r>
-              <w:rPr>
-                <w:rFonts w:ascii="Georgia" w:hAnsi="Georgia"/>
-                <w:color w:val="000000"/>
-              </w:rPr>
-              <w:t xml:space="preserve">housed inside the subterranean </w:t>
+              <w:t xml:space="preserve"> preserved consciousness housed inside the subterranean </w:t>
             </w:r>
             <w:r>
               <w:rPr>
@@ -5299,21 +4954,7 @@
               <w:rPr>
                 <w:rFonts w:ascii="Georgia" w:hAnsi="Georgia"/>
               </w:rPr>
-              <w:t xml:space="preserve">Precise, professional, and restrained. MAI provides clear guidance while withholding </w:t>
-            </w:r>
-            <w:proofErr w:type="gramStart"/>
-            <w:r>
-              <w:rPr>
-                <w:rFonts w:ascii="Georgia" w:hAnsi="Georgia"/>
-              </w:rPr>
-              <w:t>personal opinion</w:t>
-            </w:r>
-            <w:proofErr w:type="gramEnd"/>
-            <w:r>
-              <w:rPr>
-                <w:rFonts w:ascii="Georgia" w:hAnsi="Georgia"/>
-              </w:rPr>
-              <w:t>.</w:t>
+              <w:t>Precise, professional, and restrained. MAI provides clear guidance while withholding personal opinion.</w:t>
             </w:r>
           </w:p>
         </w:tc>
@@ -5924,13 +5565,7 @@
               <w:rPr>
                 <w:rFonts w:ascii="Georgia" w:hAnsi="Georgia"/>
               </w:rPr>
-              <w:t>Personal profile tool for</w:t>
-            </w:r>
-            <w:r>
-              <w:rPr>
-                <w:rFonts w:ascii="Georgia" w:hAnsi="Georgia"/>
-              </w:rPr>
-              <w:t xml:space="preserve"> character customization: appearance, pronouns, style, wardrobe </w:t>
+              <w:t xml:space="preserve">Personal profile tool for character customization: appearance, pronouns, style, wardrobe </w:t>
             </w:r>
             <w:r>
               <w:rPr>
@@ -6062,29 +5697,7 @@
                 <w:szCs w:val="22"/>
                 <w:bdr w:val="none" w:sz="0" w:space="0" w:color="auto" w:frame="1"/>
               </w:rPr>
-              <w:t xml:space="preserve">Dual-pane communication </w:t>
-            </w:r>
-            <w:proofErr w:type="gramStart"/>
-            <w:r>
-              <w:rPr>
-                <w:rFonts w:ascii="Georgia" w:eastAsia="Times New Roman" w:hAnsi="Georgia"/>
-                <w:color w:val="1F1F1F"/>
-                <w:sz w:val="22"/>
-                <w:szCs w:val="22"/>
-                <w:bdr w:val="none" w:sz="0" w:space="0" w:color="auto" w:frame="1"/>
-              </w:rPr>
-              <w:t>hub:</w:t>
-            </w:r>
-            <w:proofErr w:type="gramEnd"/>
-            <w:r>
-              <w:rPr>
-                <w:rFonts w:ascii="Georgia" w:eastAsia="Times New Roman" w:hAnsi="Georgia"/>
-                <w:color w:val="1F1F1F"/>
-                <w:sz w:val="22"/>
-                <w:szCs w:val="22"/>
-                <w:bdr w:val="none" w:sz="0" w:space="0" w:color="auto" w:frame="1"/>
-              </w:rPr>
-              <w:t xml:space="preserve"> features a real-time instant messaging chat client on one side, and a formal encrypted email inbox for Cyacademy/Career correspondence on the other.</w:t>
+              <w:t>Dual-pane communication hub: features a real-time instant messaging chat client on one side, and a formal encrypted email inbox for Cyacademy/Career correspondence on the other.</w:t>
             </w:r>
           </w:p>
         </w:tc>
@@ -6283,7 +5896,6 @@
                 <w:szCs w:val="22"/>
               </w:rPr>
             </w:pPr>
-            <w:proofErr w:type="spellStart"/>
             <w:r>
               <w:rPr>
                 <w:rFonts w:ascii="Georgia" w:eastAsia="Times New Roman" w:hAnsi="Georgia"/>
@@ -6296,7 +5908,6 @@
               </w:rPr>
               <w:t>Versenet</w:t>
             </w:r>
-            <w:proofErr w:type="spellEnd"/>
             <w:r>
               <w:rPr>
                 <w:rFonts w:ascii="Georgia" w:eastAsia="Times New Roman" w:hAnsi="Georgia"/>
@@ -6342,39 +5953,7 @@
               <w:rPr>
                 <w:rFonts w:ascii="Georgia" w:hAnsi="Georgia"/>
               </w:rPr>
-              <w:t>Public</w:t>
-            </w:r>
-            <w:r>
-              <w:rPr>
-                <w:rFonts w:ascii="Georgia" w:hAnsi="Georgia"/>
-              </w:rPr>
-              <w:t xml:space="preserve"> in-world </w:t>
-            </w:r>
-            <w:r>
-              <w:rPr>
-                <w:rFonts w:ascii="Georgia" w:hAnsi="Georgia"/>
-              </w:rPr>
-              <w:t>website network and browser experience</w:t>
-            </w:r>
-            <w:r>
-              <w:rPr>
-                <w:rFonts w:ascii="Georgia" w:hAnsi="Georgia"/>
-              </w:rPr>
-              <w:t xml:space="preserve"> giving live access to world history archives, public records, unverified user forums, and </w:t>
-            </w:r>
-            <w:proofErr w:type="gramStart"/>
-            <w:r>
-              <w:rPr>
-                <w:rFonts w:ascii="Georgia" w:hAnsi="Georgia"/>
-              </w:rPr>
-              <w:t>breaking</w:t>
-            </w:r>
-            <w:proofErr w:type="gramEnd"/>
-            <w:r>
-              <w:rPr>
-                <w:rFonts w:ascii="Georgia" w:hAnsi="Georgia"/>
-              </w:rPr>
-              <w:t xml:space="preserve"> system news.</w:t>
+              <w:t>Public in-world website network and browser experience giving live access to world history archives, public records, unverified user forums, and breaking system news.</w:t>
             </w:r>
           </w:p>
         </w:tc>
@@ -6751,16 +6330,7 @@
               </w:rPr>
             </w:pPr>
             <w:r>
-              <w:t>Job board and labor-routing portal for</w:t>
-            </w:r>
-            <w:r>
-              <w:t xml:space="preserve"> agency </w:t>
-            </w:r>
-            <w:r>
-              <w:t>shifts,</w:t>
-            </w:r>
-            <w:r>
-              <w:t xml:space="preserve"> current credit payouts, </w:t>
+              <w:t xml:space="preserve">Job board and labor-routing portal for agency shifts, current credit payouts, </w:t>
             </w:r>
             <w:r>
               <w:t>work postings, and skill-based employment opportunities</w:t>
@@ -6886,13 +6456,7 @@
               <w:rPr>
                 <w:rFonts w:ascii="Georgia" w:hAnsi="Georgia"/>
               </w:rPr>
-              <w:t>Cyacademy student portal that tracks</w:t>
-            </w:r>
-            <w:r>
-              <w:rPr>
-                <w:rFonts w:ascii="Georgia" w:hAnsi="Georgia"/>
-              </w:rPr>
-              <w:t xml:space="preserve"> academic timelines, course modules, current GPA, active club memberships, and faculty alerts.</w:t>
+              <w:t>Cyacademy student portal that tracks academic timelines, course modules, current GPA, active club memberships, and faculty alerts.</w:t>
             </w:r>
           </w:p>
         </w:tc>
@@ -7407,27 +6971,7 @@
                 <w:sz w:val="22"/>
                 <w:szCs w:val="22"/>
               </w:rPr>
-              <w:t xml:space="preserve">Secure work portal used </w:t>
-            </w:r>
-            <w:proofErr w:type="gramStart"/>
-            <w:r>
-              <w:rPr>
-                <w:rFonts w:ascii="Georgia" w:hAnsi="Georgia"/>
-                <w:color w:val="1F1F1F"/>
-                <w:sz w:val="22"/>
-                <w:szCs w:val="22"/>
-              </w:rPr>
-              <w:t>by</w:t>
-            </w:r>
-            <w:proofErr w:type="gramEnd"/>
-            <w:r>
-              <w:rPr>
-                <w:rFonts w:ascii="Georgia" w:hAnsi="Georgia"/>
-                <w:color w:val="1F1F1F"/>
-                <w:sz w:val="22"/>
-                <w:szCs w:val="22"/>
-              </w:rPr>
-              <w:t xml:space="preserve"> eligible jobs. Each department has its own physical workstation, but all authorized roles log into the same centralized system to access assignments, clearance tools, records, shift actions, and role-specific interfaces.</w:t>
+              <w:t>Secure work portal used by eligible jobs. Each department has its own physical workstation, but all authorized roles log into the same centralized system to access assignments, clearance tools, records, shift actions, and role-specific interfaces.</w:t>
             </w:r>
           </w:p>
         </w:tc>
@@ -7453,35 +6997,7 @@
         <w:rPr>
           <w:rFonts w:ascii="Georgia" w:hAnsi="Georgia"/>
         </w:rPr>
-        <w:t xml:space="preserve"> — Civic services website </w:t>
-      </w:r>
-      <w:proofErr w:type="gramStart"/>
-      <w:r>
-        <w:rPr>
-          <w:rFonts w:ascii="Georgia" w:hAnsi="Georgia"/>
-        </w:rPr>
-        <w:t>hub</w:t>
-      </w:r>
-      <w:proofErr w:type="gramEnd"/>
-      <w:r>
-        <w:rPr>
-          <w:rFonts w:ascii="Georgia" w:hAnsi="Georgia"/>
-        </w:rPr>
-        <w:t xml:space="preserve"> for official </w:t>
-      </w:r>
-      <w:proofErr w:type="spellStart"/>
-      <w:r>
-        <w:rPr>
-          <w:rFonts w:ascii="Georgia" w:hAnsi="Georgia"/>
-        </w:rPr>
-        <w:t>Meridion</w:t>
-      </w:r>
-      <w:proofErr w:type="spellEnd"/>
-      <w:r>
-        <w:rPr>
-          <w:rFonts w:ascii="Georgia" w:hAnsi="Georgia"/>
-        </w:rPr>
-        <w:t xml:space="preserve"> institutions, including public archive searches, banking access, health appointments, and citizen-service notices.</w:t>
+        <w:t xml:space="preserve"> — Civic services website hub for official Meridion institutions, including public archive searches, banking access, health appointments, and citizen-service notices.</w:t>
       </w:r>
     </w:p>
     <w:p>
@@ -8578,7 +8094,7 @@
           <w:szCs w:val="22"/>
         </w:rPr>
         <w:pict w14:anchorId="7850DD18">
-          <v:rect id="_x0000_i1036" style="width:0;height:1.5pt" o:hralign="center" o:hrstd="t" o:hr="t" fillcolor="#a0a0a0" stroked="f"/>
+          <v:rect id="_x0000_i1025" style="width:0;height:1.5pt" o:hralign="center" o:hrstd="t" o:hr="t" fillcolor="#a0a0a0" stroked="f"/>
         </w:pict>
       </w:r>
     </w:p>
@@ -8719,21 +8235,7 @@
               <w:rPr>
                 <w:rFonts w:ascii="Georgia" w:hAnsi="Georgia"/>
               </w:rPr>
-              <w:t xml:space="preserve"> ECHO remembers one who came before — and disappeared. Headmistress </w:t>
-            </w:r>
-            <w:proofErr w:type="spellStart"/>
-            <w:r>
-              <w:rPr>
-                <w:rFonts w:ascii="Georgia" w:hAnsi="Georgia"/>
-              </w:rPr>
-              <w:t>Vael</w:t>
-            </w:r>
-            <w:proofErr w:type="spellEnd"/>
-            <w:r>
-              <w:rPr>
-                <w:rFonts w:ascii="Georgia" w:hAnsi="Georgia"/>
-              </w:rPr>
-              <w:t xml:space="preserve"> has records of others, kept from the High Council. The pattern of </w:t>
+              <w:t xml:space="preserve"> ECHO remembers one who came before — and disappeared. Headmistress Vael has records of others, kept from the High Council. The pattern of </w:t>
             </w:r>
             <w:r>
               <w:rPr>
@@ -8772,27 +8274,7 @@
               <w:rPr>
                 <w:rFonts w:ascii="Georgia" w:hAnsi="Georgia"/>
               </w:rPr>
-              <w:t xml:space="preserve"> history that points directly to </w:t>
-            </w:r>
-            <w:proofErr w:type="gramStart"/>
-            <w:r>
-              <w:rPr>
-                <w:rFonts w:ascii="Georgia" w:hAnsi="Georgia"/>
-              </w:rPr>
-              <w:t>the PRISM's</w:t>
-            </w:r>
-            <w:proofErr w:type="gramEnd"/>
-            <w:r>
-              <w:rPr>
-                <w:rFonts w:ascii="Georgia" w:hAnsi="Georgia"/>
-              </w:rPr>
-              <w:t xml:space="preserve"> TBD</w:t>
-            </w:r>
-            <w:r>
-              <w:rPr>
-                <w:rFonts w:ascii="Georgia" w:hAnsi="Georgia"/>
-              </w:rPr>
-              <w:t xml:space="preserve"> 7 and the Original Creator's true intention for the MIRAVERSE.</w:t>
+              <w:t xml:space="preserve"> history that points directly to the PRISM's TBD 7 and the Original Creator's true intention for the MIRAVERSE.</w:t>
             </w:r>
           </w:p>
         </w:tc>
@@ -9435,25 +8917,7 @@
               <w:rPr>
                 <w:rFonts w:ascii="Georgia" w:hAnsi="Georgia"/>
               </w:rPr>
-              <w:t xml:space="preserve">Emits a concentrated burst of White </w:t>
-            </w:r>
-            <w:r>
-              <w:rPr>
-                <w:rFonts w:ascii="Georgia" w:hAnsi="Georgia"/>
-              </w:rPr>
-              <w:t>TBD</w:t>
-            </w:r>
-            <w:r>
-              <w:rPr>
-                <w:rFonts w:ascii="Georgia" w:hAnsi="Georgia"/>
-              </w:rPr>
-              <w:t xml:space="preserve"> energy. Functions as </w:t>
-            </w:r>
-            <w:r>
-              <w:rPr>
-                <w:rFonts w:ascii="Georgia" w:hAnsi="Georgia"/>
-              </w:rPr>
-              <w:t xml:space="preserve">a </w:t>
+              <w:t xml:space="preserve">Emits a concentrated burst of White TBD energy. Functions as a </w:t>
             </w:r>
             <w:r>
               <w:t>data-space</w:t>
@@ -9462,13 +8926,7 @@
               <w:rPr>
                 <w:rFonts w:ascii="Georgia" w:hAnsi="Georgia"/>
               </w:rPr>
-              <w:t xml:space="preserve"> tool and </w:t>
-            </w:r>
-            <w:r>
-              <w:rPr>
-                <w:rFonts w:ascii="Georgia" w:hAnsi="Georgia"/>
-              </w:rPr>
-              <w:t xml:space="preserve">environmental puzzle element. </w:t>
+              <w:t xml:space="preserve"> tool and environmental puzzle element. </w:t>
             </w:r>
             <w:r>
               <w:t>Stabilizes corrupted pathways</w:t>
@@ -9477,25 +8935,7 @@
               <w:rPr>
                 <w:rFonts w:ascii="Georgia" w:hAnsi="Georgia"/>
               </w:rPr>
-              <w:t xml:space="preserve">, overloads PRISM-locked doors, </w:t>
-            </w:r>
-            <w:r>
-              <w:rPr>
-                <w:rFonts w:ascii="Georgia" w:hAnsi="Georgia"/>
-              </w:rPr>
-              <w:t xml:space="preserve">reveals hidden </w:t>
-            </w:r>
-            <w:r>
-              <w:rPr>
-                <w:rFonts w:ascii="Georgia" w:hAnsi="Georgia"/>
-              </w:rPr>
-              <w:t>TBD</w:t>
-            </w:r>
-            <w:r>
-              <w:rPr>
-                <w:rFonts w:ascii="Georgia" w:hAnsi="Georgia"/>
-              </w:rPr>
-              <w:t xml:space="preserve"> 7 inscriptions</w:t>
+              <w:t>, overloads PRISM-locked doors, reveals hidden TBD 7 inscriptions</w:t>
             </w:r>
             <w:r>
               <w:t>, and temporarily clarifies unstable Veil geometry</w:t>
@@ -9609,41 +9049,13 @@
               <w:rPr>
                 <w:rFonts w:ascii="Georgia" w:hAnsi="Georgia"/>
               </w:rPr>
-              <w:t xml:space="preserve"> </w:t>
-            </w:r>
-            <w:proofErr w:type="gramStart"/>
-            <w:r>
-              <w:rPr>
-                <w:rFonts w:ascii="Georgia" w:hAnsi="Georgia"/>
-              </w:rPr>
-              <w:t>expression</w:t>
-            </w:r>
-            <w:proofErr w:type="gramEnd"/>
-            <w:r>
-              <w:rPr>
-                <w:rFonts w:ascii="Georgia" w:hAnsi="Georgia"/>
-              </w:rPr>
-              <w:t xml:space="preserve"> of the player’s accumulated knowledge and influence.</w:t>
-            </w:r>
-            <w:r>
-              <w:rPr>
-                <w:rFonts w:ascii="Georgia" w:hAnsi="Georgia"/>
-              </w:rPr>
-              <w:t xml:space="preserve"> </w:t>
-            </w:r>
-            <w:proofErr w:type="gramStart"/>
-            <w:r>
-              <w:rPr>
-                <w:rFonts w:ascii="Georgia" w:hAnsi="Georgia"/>
-              </w:rPr>
-              <w:t>Allows</w:t>
-            </w:r>
-            <w:proofErr w:type="gramEnd"/>
-            <w:r>
-              <w:rPr>
-                <w:rFonts w:ascii="Georgia" w:hAnsi="Georgia"/>
-              </w:rPr>
-              <w:t xml:space="preserve"> the rewriting of a small but real element of the MIRAVERSE's underlying code</w:t>
+              <w:t xml:space="preserve"> expression of the player’s accumulated knowledge and influence.</w:t>
+            </w:r>
+            <w:r>
+              <w:rPr>
+                <w:rFonts w:ascii="Georgia" w:hAnsi="Georgia"/>
+              </w:rPr>
+              <w:t xml:space="preserve"> Allows the rewriting of a small but real element of the MIRAVERSE's underlying code</w:t>
             </w:r>
             <w:r>
               <w:rPr>
@@ -9722,7 +9134,6 @@
           <w14:ligatures w14:val="standardContextual"/>
         </w:rPr>
       </w:pPr>
-      <w:proofErr w:type="spellStart"/>
       <w:r>
         <w:rPr>
           <w:rFonts w:ascii="Georgia" w:hAnsi="Georgia"/>
@@ -9730,17 +9141,7 @@
           <w:sz w:val="22"/>
           <w:szCs w:val="22"/>
         </w:rPr>
-        <w:t>Meridion</w:t>
-      </w:r>
-      <w:proofErr w:type="spellEnd"/>
-      <w:r>
-        <w:rPr>
-          <w:rFonts w:ascii="Georgia" w:hAnsi="Georgia"/>
-          <w:color w:val="1A1A1A"/>
-          <w:sz w:val="22"/>
-          <w:szCs w:val="22"/>
-        </w:rPr>
-        <w:t xml:space="preserve"> is an oligarchic matriarchal monarchy. The imperial crown sits in </w:t>
+        <w:t xml:space="preserve">Meridion is an oligarchic matriarchal monarchy. The imperial crown sits in </w:t>
       </w:r>
       <w:r>
         <w:rPr>
@@ -9760,27 +9161,7 @@
           <w:sz w:val="22"/>
           <w:szCs w:val="22"/>
         </w:rPr>
-        <w:t xml:space="preserve">, while the Royal Council represents the seven elemental regions: Orynvell, Fross, Lumia, Marlowe, </w:t>
-      </w:r>
-      <w:proofErr w:type="spellStart"/>
-      <w:r>
-        <w:rPr>
-          <w:rFonts w:ascii="Georgia" w:hAnsi="Georgia"/>
-          <w:color w:val="1A1A1A"/>
-          <w:sz w:val="22"/>
-          <w:szCs w:val="22"/>
-        </w:rPr>
-        <w:t>Brisland</w:t>
-      </w:r>
-      <w:proofErr w:type="spellEnd"/>
-      <w:r>
-        <w:rPr>
-          <w:rFonts w:ascii="Georgia" w:hAnsi="Georgia"/>
-          <w:color w:val="1A1A1A"/>
-          <w:sz w:val="22"/>
-          <w:szCs w:val="22"/>
-        </w:rPr>
-        <w:t>, Kaji, and Nephele. Council members are not interchangeable nobles; each one carries a realm mandate tied to land stewardship, elemental authority, seasonal law, and lineage memory.</w:t>
+        <w:t>, while the Royal Council represents the seven elemental regions: Orynvell, Fross, Lumia, Marlowe, Brisland, Kaji, and Nephele. Council members are not interchangeable nobles; each one carries a realm mandate tied to land stewardship, elemental authority, seasonal law, and lineage memory.</w:t>
       </w:r>
     </w:p>
     <w:p>
@@ -9967,21 +9348,7 @@
               <w:rPr>
                 <w:rFonts w:ascii="Georgia" w:hAnsi="Georgia"/>
               </w:rPr>
-              <w:t xml:space="preserve"> </w:t>
-            </w:r>
-            <w:proofErr w:type="spellStart"/>
-            <w:r>
-              <w:rPr>
-                <w:rFonts w:ascii="Georgia" w:hAnsi="Georgia"/>
-              </w:rPr>
-              <w:t>Orynvell’s</w:t>
-            </w:r>
-            <w:proofErr w:type="spellEnd"/>
-            <w:r>
-              <w:rPr>
-                <w:rFonts w:ascii="Georgia" w:hAnsi="Georgia"/>
-              </w:rPr>
-              <w:t xml:space="preserve"> authority depends on </w:t>
+              <w:t xml:space="preserve"> Orynvell’s authority depends on </w:t>
             </w:r>
             <w:r>
               <w:rPr>
@@ -10005,13 +9372,7 @@
               <w:rPr>
                 <w:rFonts w:ascii="Georgia" w:hAnsi="Georgia"/>
               </w:rPr>
-              <w:t xml:space="preserve"> Any doubt about </w:t>
-            </w:r>
-            <w:r>
-              <w:rPr>
-                <w:rFonts w:ascii="Georgia" w:hAnsi="Georgia"/>
-              </w:rPr>
-              <w:t>origin</w:t>
+              <w:t xml:space="preserve"> Any doubt about origin</w:t>
             </w:r>
             <w:r>
               <w:rPr>
@@ -10122,30 +9483,8 @@
               <w:rPr>
                 <w:rFonts w:ascii="Georgia" w:hAnsi="Georgia"/>
               </w:rPr>
-              <w:t xml:space="preserve"> Holly lineages of </w:t>
-            </w:r>
-            <w:proofErr w:type="spellStart"/>
-            <w:r>
-              <w:rPr>
-                <w:rFonts w:ascii="Georgia" w:hAnsi="Georgia"/>
-              </w:rPr>
-              <w:t>Northwake</w:t>
-            </w:r>
-            <w:proofErr w:type="spellEnd"/>
-            <w:r>
-              <w:rPr>
-                <w:rFonts w:ascii="Georgia" w:hAnsi="Georgia"/>
-              </w:rPr>
-              <w:t xml:space="preserve"> and </w:t>
-            </w:r>
-            <w:proofErr w:type="spellStart"/>
-            <w:r>
-              <w:rPr>
-                <w:rFonts w:ascii="Georgia" w:hAnsi="Georgia"/>
-              </w:rPr>
-              <w:t>Southwake</w:t>
-            </w:r>
-            <w:proofErr w:type="spellEnd"/>
+              <w:t xml:space="preserve"> Holly lineages of Northwake and Southwake</w:t>
+            </w:r>
           </w:p>
           <w:p>
             <w:pPr>
@@ -10273,16 +9612,8 @@
               <w:rPr>
                 <w:rFonts w:ascii="Georgia" w:hAnsi="Georgia"/>
               </w:rPr>
-              <w:t xml:space="preserve"> </w:t>
-            </w:r>
-            <w:proofErr w:type="spellStart"/>
-            <w:r>
-              <w:rPr>
-                <w:rFonts w:ascii="Georgia" w:hAnsi="Georgia"/>
-              </w:rPr>
-              <w:t>Rhyna</w:t>
-            </w:r>
-            <w:proofErr w:type="spellEnd"/>
+              <w:t xml:space="preserve"> Rhyna</w:t>
+            </w:r>
           </w:p>
           <w:p>
             <w:pPr>
@@ -10431,16 +9762,8 @@
               <w:rPr>
                 <w:rFonts w:ascii="Georgia" w:hAnsi="Georgia"/>
               </w:rPr>
-              <w:t xml:space="preserve"> </w:t>
-            </w:r>
-            <w:proofErr w:type="spellStart"/>
-            <w:r>
-              <w:rPr>
-                <w:rFonts w:ascii="Georgia" w:hAnsi="Georgia"/>
-              </w:rPr>
-              <w:t>Neryx</w:t>
-            </w:r>
-            <w:proofErr w:type="spellEnd"/>
+              <w:t xml:space="preserve"> Neryx</w:t>
+            </w:r>
           </w:p>
           <w:p>
             <w:pPr>
@@ -10610,21 +9933,7 @@
               <w:rPr>
                 <w:rFonts w:ascii="Georgia" w:hAnsi="Georgia"/>
               </w:rPr>
-              <w:t xml:space="preserve"> Trade winds, migration, culture, messages, judgment, and </w:t>
-            </w:r>
-            <w:proofErr w:type="spellStart"/>
-            <w:r>
-              <w:rPr>
-                <w:rFonts w:ascii="Georgia" w:hAnsi="Georgia"/>
-              </w:rPr>
-              <w:t>interrealm</w:t>
-            </w:r>
-            <w:proofErr w:type="spellEnd"/>
-            <w:r>
-              <w:rPr>
-                <w:rFonts w:ascii="Georgia" w:hAnsi="Georgia"/>
-              </w:rPr>
-              <w:t xml:space="preserve"> exchange.</w:t>
+              <w:t xml:space="preserve"> Trade winds, migration, culture, messages, judgment, and interrealm exchange.</w:t>
             </w:r>
           </w:p>
           <w:p>
@@ -10645,21 +9954,7 @@
               <w:rPr>
                 <w:rFonts w:ascii="Georgia" w:hAnsi="Georgia"/>
               </w:rPr>
-              <w:t xml:space="preserve"> </w:t>
-            </w:r>
-            <w:proofErr w:type="spellStart"/>
-            <w:r>
-              <w:rPr>
-                <w:rFonts w:ascii="Georgia" w:hAnsi="Georgia"/>
-              </w:rPr>
-              <w:t>Brisland</w:t>
-            </w:r>
-            <w:proofErr w:type="spellEnd"/>
-            <w:r>
-              <w:rPr>
-                <w:rFonts w:ascii="Georgia" w:hAnsi="Georgia"/>
-              </w:rPr>
-              <w:t xml:space="preserve"> controls routes, rumors, and reputation. Its influence is subtle, mobile, and difficult for the Crown to pin down.</w:t>
+              <w:t xml:space="preserve"> Brisland controls routes, rumors, and reputation. Its influence is subtle, mobile, and difficult for the Crown to pin down.</w:t>
             </w:r>
           </w:p>
         </w:tc>
@@ -10767,21 +10062,7 @@
               <w:rPr>
                 <w:rFonts w:ascii="Georgia" w:hAnsi="Georgia"/>
               </w:rPr>
-              <w:t xml:space="preserve"> Sacred flame, volcanic power, </w:t>
-            </w:r>
-            <w:proofErr w:type="spellStart"/>
-            <w:r>
-              <w:rPr>
-                <w:rFonts w:ascii="Georgia" w:hAnsi="Georgia"/>
-              </w:rPr>
-              <w:t>forgecraft</w:t>
-            </w:r>
-            <w:proofErr w:type="spellEnd"/>
-            <w:r>
-              <w:rPr>
-                <w:rFonts w:ascii="Georgia" w:hAnsi="Georgia"/>
-              </w:rPr>
-              <w:t>, military industry, passion, and dangerous innovation.</w:t>
+              <w:t xml:space="preserve"> Sacred flame, volcanic power, forgecraft, military industry, passion, and dangerous innovation.</w:t>
             </w:r>
           </w:p>
           <w:p>
@@ -10802,21 +10083,7 @@
               <w:rPr>
                 <w:rFonts w:ascii="Georgia" w:hAnsi="Georgia"/>
               </w:rPr>
-              <w:t xml:space="preserve"> Kaji’s dual Ember-Seraphima authority makes it both loyal to the throne and capable of challenging </w:t>
-            </w:r>
-            <w:proofErr w:type="spellStart"/>
-            <w:r>
-              <w:rPr>
-                <w:rFonts w:ascii="Georgia" w:hAnsi="Georgia"/>
-              </w:rPr>
-              <w:t>Orynvell’s</w:t>
-            </w:r>
-            <w:proofErr w:type="spellEnd"/>
-            <w:r>
-              <w:rPr>
-                <w:rFonts w:ascii="Georgia" w:hAnsi="Georgia"/>
-              </w:rPr>
-              <w:t xml:space="preserve"> monopoly on sacred fire.</w:t>
+              <w:t xml:space="preserve"> Kaji’s dual Ember-Seraphima authority makes it both loyal to the throne and capable of challenging Orynvell’s monopoly on sacred fire.</w:t>
             </w:r>
           </w:p>
         </w:tc>
@@ -11023,19 +10290,7 @@
         <w:rPr>
           <w:rFonts w:ascii="Georgia" w:hAnsi="Georgia"/>
         </w:rPr>
-        <w:t xml:space="preserve"> is the MIRAVERSE's premier institution of learning, located at the civic heart of </w:t>
-      </w:r>
-      <w:r>
-        <w:rPr>
-          <w:rFonts w:ascii="Georgia" w:hAnsi="Georgia"/>
-        </w:rPr>
-        <w:t>AURELINE</w:t>
-      </w:r>
-      <w:r>
-        <w:rPr>
-          <w:rFonts w:ascii="Georgia" w:hAnsi="Georgia"/>
-        </w:rPr>
-        <w:t xml:space="preserve">. </w:t>
+        <w:t xml:space="preserve"> is the MIRAVERSE's premier institution of learning, located at the civic heart of AURELINE. </w:t>
       </w:r>
       <w:r>
         <w:rPr>
@@ -11047,13 +10302,7 @@
         <w:rPr>
           <w:rFonts w:ascii="Georgia" w:hAnsi="Georgia"/>
         </w:rPr>
-        <w:t xml:space="preserve"> citizens </w:t>
-      </w:r>
-      <w:r>
-        <w:rPr>
-          <w:rFonts w:ascii="Georgia" w:hAnsi="Georgia"/>
-        </w:rPr>
-        <w:t xml:space="preserve">are </w:t>
+        <w:t xml:space="preserve"> citizens are </w:t>
       </w:r>
       <w:r>
         <w:rPr>
@@ -11362,10 +10611,7 @@
               </w:rPr>
             </w:pPr>
             <w:r>
-              <w:t>Civic Registration</w:t>
-            </w:r>
-            <w:r>
-              <w:t xml:space="preserve"> Assembly, First Exam Week, player meets core NPC cast</w:t>
+              <w:t>Civic Registration Assembly, First Exam Week, player meets core NPC cast</w:t>
             </w:r>
           </w:p>
         </w:tc>
@@ -11477,10 +10723,7 @@
               <w:t>data breach</w:t>
             </w:r>
             <w:r>
-              <w:t xml:space="preserve"> near UMBRA WARD, </w:t>
-            </w:r>
-            <w:r>
-              <w:t>deeper civic access begins</w:t>
+              <w:t xml:space="preserve"> near UMBRA WARD, deeper civic access begins</w:t>
             </w:r>
           </w:p>
         </w:tc>
@@ -12567,16 +11810,7 @@
               </w:rPr>
             </w:pPr>
             <w:r>
-              <w:t xml:space="preserve">Ecological </w:t>
-            </w:r>
-            <w:r>
-              <w:t xml:space="preserve">Warden, Healer, Grove Keeper, </w:t>
-            </w:r>
-            <w:r>
-              <w:t xml:space="preserve">Environmental </w:t>
-            </w:r>
-            <w:r>
-              <w:t>Analyst</w:t>
+              <w:t>Ecological Warden, Healer, Grove Keeper, Environmental Analyst</w:t>
             </w:r>
           </w:p>
         </w:tc>
@@ -12657,19 +11891,8 @@
                 <w:bCs/>
                 <w:color w:val="0D5C6E"/>
               </w:rPr>
-              <w:t xml:space="preserve">Headmistress </w:t>
-            </w:r>
-            <w:proofErr w:type="spellStart"/>
-            <w:r>
-              <w:rPr>
-                <w:rFonts w:ascii="Georgia" w:hAnsi="Georgia"/>
-                <w:b/>
-                <w:bCs/>
-                <w:color w:val="0D5C6E"/>
-              </w:rPr>
-              <w:t>Vael</w:t>
-            </w:r>
-            <w:proofErr w:type="spellEnd"/>
+              <w:t>Headmistress Vael</w:t>
+            </w:r>
           </w:p>
           <w:p>
             <w:pPr>
@@ -12693,16 +11916,8 @@
               <w:rPr>
                 <w:rFonts w:ascii="Georgia" w:hAnsi="Georgia"/>
               </w:rPr>
-              <w:t xml:space="preserve"> 7 and has structured much of </w:t>
-            </w:r>
-            <w:proofErr w:type="spellStart"/>
-            <w:r>
-              <w:rPr>
-                <w:rFonts w:ascii="Georgia" w:hAnsi="Georgia"/>
-              </w:rPr>
-              <w:t>Cyacademy's</w:t>
-            </w:r>
-            <w:proofErr w:type="spellEnd"/>
+              <w:t xml:space="preserve"> 7 and has structured much of Cyacademy's</w:t>
+            </w:r>
             <w:r>
               <w:rPr>
                 <w:rFonts w:ascii="Georgia" w:hAnsi="Georgia"/>
@@ -13001,21 +12216,7 @@
               <w:rPr>
                 <w:rFonts w:ascii="Georgia" w:hAnsi="Georgia"/>
               </w:rPr>
-              <w:t xml:space="preserve">Shrewd, kind, and extraordinarily perceptive. Runs the student council. One of the few faculty </w:t>
-            </w:r>
-            <w:proofErr w:type="gramStart"/>
-            <w:r>
-              <w:rPr>
-                <w:rFonts w:ascii="Georgia" w:hAnsi="Georgia"/>
-              </w:rPr>
-              <w:t>members who</w:t>
-            </w:r>
-            <w:proofErr w:type="gramEnd"/>
-            <w:r>
-              <w:rPr>
-                <w:rFonts w:ascii="Georgia" w:hAnsi="Georgia"/>
-              </w:rPr>
-              <w:t xml:space="preserve"> actively pushes students to question the status quo — carefully enough to keep her job.</w:t>
+              <w:t>Shrewd, kind, and extraordinarily perceptive. Runs the student council. One of the few faculty members who actively pushes students to question the status quo — carefully enough to keep her job.</w:t>
             </w:r>
           </w:p>
         </w:tc>
@@ -13765,27 +12966,7 @@
                 <w:sz w:val="22"/>
                 <w:szCs w:val="22"/>
               </w:rPr>
-              <w:t xml:space="preserve">Honesty, </w:t>
-            </w:r>
-            <w:proofErr w:type="gramStart"/>
-            <w:r>
-              <w:rPr>
-                <w:rFonts w:ascii="Georgia" w:eastAsia="Corbel" w:hAnsi="Georgia" w:cs="Corbel"/>
-                <w:color w:val="1A1A1A"/>
-                <w:sz w:val="22"/>
-                <w:szCs w:val="22"/>
-              </w:rPr>
-              <w:t>kept</w:t>
-            </w:r>
-            <w:proofErr w:type="gramEnd"/>
-            <w:r>
-              <w:rPr>
-                <w:rFonts w:ascii="Georgia" w:eastAsia="Corbel" w:hAnsi="Georgia" w:cs="Corbel"/>
-                <w:color w:val="1A1A1A"/>
-                <w:sz w:val="22"/>
-                <w:szCs w:val="22"/>
-              </w:rPr>
-              <w:t xml:space="preserve"> secrets, completing personal quests</w:t>
+              <w:t>Honesty, kept secrets, completing personal quests</w:t>
             </w:r>
           </w:p>
         </w:tc>
@@ -14665,21 +13846,7 @@
               <w:rPr>
                 <w:rFonts w:ascii="Georgia" w:hAnsi="Georgia"/>
               </w:rPr>
-              <w:t xml:space="preserve">Technical </w:t>
-            </w:r>
-            <w:proofErr w:type="gramStart"/>
-            <w:r>
-              <w:rPr>
-                <w:rFonts w:ascii="Georgia" w:hAnsi="Georgia"/>
-              </w:rPr>
-              <w:t>ally</w:t>
-            </w:r>
-            <w:proofErr w:type="gramEnd"/>
-            <w:r>
-              <w:rPr>
-                <w:rFonts w:ascii="Georgia" w:hAnsi="Georgia"/>
-              </w:rPr>
-              <w:t xml:space="preserve"> and trust route</w:t>
+              <w:t>Technical ally and trust route</w:t>
             </w:r>
           </w:p>
         </w:tc>
@@ -14717,33 +13884,11 @@
                 <w:rFonts w:ascii="Georgia" w:hAnsi="Georgia"/>
               </w:rPr>
             </w:pPr>
-            <w:proofErr w:type="gramStart"/>
-            <w:r>
-              <w:rPr>
-                <w:rFonts w:ascii="Georgia" w:hAnsi="Georgia"/>
-              </w:rPr>
-              <w:t>Helps</w:t>
-            </w:r>
-            <w:proofErr w:type="gramEnd"/>
-            <w:r>
-              <w:rPr>
-                <w:rFonts w:ascii="Georgia" w:hAnsi="Georgia"/>
-              </w:rPr>
-              <w:t xml:space="preserve"> reveal the logical structure beneath </w:t>
-            </w:r>
-            <w:proofErr w:type="spellStart"/>
-            <w:r>
-              <w:rPr>
-                <w:rFonts w:ascii="Georgia" w:hAnsi="Georgia"/>
-              </w:rPr>
-              <w:t>Meridion’s</w:t>
-            </w:r>
-            <w:proofErr w:type="spellEnd"/>
-            <w:r>
-              <w:rPr>
-                <w:rFonts w:ascii="Georgia" w:hAnsi="Georgia"/>
-              </w:rPr>
-              <w:t xml:space="preserve"> magical surface.</w:t>
+            <w:r>
+              <w:rPr>
+                <w:rFonts w:ascii="Georgia" w:hAnsi="Georgia"/>
+              </w:rPr>
+              <w:t>Helps reveal the logical structure beneath Meridion’s magical surface.</w:t>
             </w:r>
           </w:p>
         </w:tc>
@@ -14870,19 +14015,11 @@
                 <w:rFonts w:ascii="Georgia" w:hAnsi="Georgia"/>
               </w:rPr>
             </w:pPr>
-            <w:proofErr w:type="gramStart"/>
-            <w:r>
-              <w:rPr>
-                <w:rFonts w:ascii="Georgia" w:hAnsi="Georgia"/>
-              </w:rPr>
-              <w:t>Rewards</w:t>
-            </w:r>
-            <w:proofErr w:type="gramEnd"/>
-            <w:r>
-              <w:rPr>
-                <w:rFonts w:ascii="Georgia" w:hAnsi="Georgia"/>
-              </w:rPr>
-              <w:t xml:space="preserve"> humor, curiosity, spontaneity, and loyalty</w:t>
+            <w:r>
+              <w:rPr>
+                <w:rFonts w:ascii="Georgia" w:hAnsi="Georgia"/>
+              </w:rPr>
+              <w:t>Rewards humor, curiosity, spontaneity, and loyalty</w:t>
             </w:r>
           </w:p>
         </w:tc>
@@ -15052,21 +14189,7 @@
               <w:rPr>
                 <w:rFonts w:ascii="Georgia" w:hAnsi="Georgia"/>
               </w:rPr>
-              <w:t xml:space="preserve">Forces questions about whether knowledge should be freed when </w:t>
-            </w:r>
-            <w:proofErr w:type="gramStart"/>
-            <w:r>
-              <w:rPr>
-                <w:rFonts w:ascii="Georgia" w:hAnsi="Georgia"/>
-              </w:rPr>
-              <w:t>it</w:t>
-            </w:r>
-            <w:proofErr w:type="gramEnd"/>
-            <w:r>
-              <w:rPr>
-                <w:rFonts w:ascii="Georgia" w:hAnsi="Georgia"/>
-              </w:rPr>
-              <w:t xml:space="preserve"> destabilizes the world.</w:t>
+              <w:t>Forces questions about whether knowledge should be freed when it destabilizes the world.</w:t>
             </w:r>
           </w:p>
         </w:tc>
@@ -15197,21 +14320,7 @@
               <w:rPr>
                 <w:rFonts w:ascii="Georgia" w:hAnsi="Georgia"/>
               </w:rPr>
-              <w:t xml:space="preserve">Supports wellness, healing, </w:t>
-            </w:r>
-            <w:proofErr w:type="spellStart"/>
-            <w:r>
-              <w:rPr>
-                <w:rFonts w:ascii="Georgia" w:hAnsi="Georgia"/>
-              </w:rPr>
-              <w:t>Veilwilt</w:t>
-            </w:r>
-            <w:proofErr w:type="spellEnd"/>
-            <w:r>
-              <w:rPr>
-                <w:rFonts w:ascii="Georgia" w:hAnsi="Georgia"/>
-              </w:rPr>
-              <w:t xml:space="preserve"> treatment, and emotional-care quests</w:t>
+              <w:t>Supports wellness, healing, Veilwilt treatment, and emotional-care quests</w:t>
             </w:r>
           </w:p>
         </w:tc>
@@ -15255,16 +14364,8 @@
               <w:rPr>
                 <w:rFonts w:ascii="Georgia" w:hAnsi="Georgia"/>
               </w:rPr>
-              <w:t xml:space="preserve">Riven </w:t>
-            </w:r>
-            <w:proofErr w:type="spellStart"/>
-            <w:r>
-              <w:rPr>
-                <w:rFonts w:ascii="Georgia" w:hAnsi="Georgia"/>
-              </w:rPr>
-              <w:t>Kalbera</w:t>
-            </w:r>
-            <w:proofErr w:type="spellEnd"/>
+              <w:t>Riven Kalbera</w:t>
+            </w:r>
           </w:p>
         </w:tc>
         <w:tc>
@@ -16010,21 +15111,7 @@
               <w:rPr>
                 <w:rFonts w:ascii="Georgia" w:hAnsi="Georgia"/>
               </w:rPr>
-              <w:t xml:space="preserve">Connects personal memory to </w:t>
-            </w:r>
-            <w:proofErr w:type="spellStart"/>
-            <w:r>
-              <w:rPr>
-                <w:rFonts w:ascii="Georgia" w:hAnsi="Georgia"/>
-              </w:rPr>
-              <w:t>Meridion’s</w:t>
-            </w:r>
-            <w:proofErr w:type="spellEnd"/>
-            <w:r>
-              <w:rPr>
-                <w:rFonts w:ascii="Georgia" w:hAnsi="Georgia"/>
-              </w:rPr>
-              <w:t xml:space="preserve"> larger system truth.</w:t>
+              <w:t>Connects personal memory to Meridion’s larger system truth.</w:t>
             </w:r>
           </w:p>
         </w:tc>
@@ -16113,21 +15200,7 @@
               <w:rPr>
                 <w:rFonts w:ascii="Georgia" w:hAnsi="Georgia"/>
               </w:rPr>
-              <w:t xml:space="preserve">House </w:t>
-            </w:r>
-            <w:proofErr w:type="spellStart"/>
-            <w:r>
-              <w:rPr>
-                <w:rFonts w:ascii="Georgia" w:hAnsi="Georgia"/>
-              </w:rPr>
-              <w:t>Aurelith</w:t>
-            </w:r>
-            <w:proofErr w:type="spellEnd"/>
-            <w:r>
-              <w:rPr>
-                <w:rFonts w:ascii="Georgia" w:hAnsi="Georgia"/>
-              </w:rPr>
-              <w:t xml:space="preserve"> / The Velvet</w:t>
+              <w:t>House Aurelith / The Velvet</w:t>
             </w:r>
           </w:p>
         </w:tc>
@@ -16229,16 +15302,8 @@
                 <w:rFonts w:ascii="Georgia" w:hAnsi="Georgia"/>
               </w:rPr>
               <w:lastRenderedPageBreak/>
-              <w:t xml:space="preserve">Headmistress </w:t>
-            </w:r>
-            <w:proofErr w:type="spellStart"/>
-            <w:r>
-              <w:rPr>
-                <w:rFonts w:ascii="Georgia" w:hAnsi="Georgia"/>
-              </w:rPr>
-              <w:t>Vael</w:t>
-            </w:r>
-            <w:proofErr w:type="spellEnd"/>
+              <w:t>Headmistress Vael</w:t>
+            </w:r>
           </w:p>
         </w:tc>
         <w:tc>
@@ -16359,19 +15424,11 @@
                 <w:rFonts w:ascii="Georgia" w:hAnsi="Georgia"/>
               </w:rPr>
             </w:pPr>
-            <w:proofErr w:type="gramStart"/>
-            <w:r>
-              <w:rPr>
-                <w:rFonts w:ascii="Georgia" w:hAnsi="Georgia"/>
-              </w:rPr>
-              <w:t>Knows</w:t>
-            </w:r>
-            <w:proofErr w:type="gramEnd"/>
-            <w:r>
-              <w:rPr>
-                <w:rFonts w:ascii="Georgia" w:hAnsi="Georgia"/>
-              </w:rPr>
-              <w:t xml:space="preserve"> more than she admits and will not be rushed.</w:t>
+            <w:r>
+              <w:rPr>
+                <w:rFonts w:ascii="Georgia" w:hAnsi="Georgia"/>
+              </w:rPr>
+              <w:t>Knows more than she admits and will not be rushed.</w:t>
             </w:r>
           </w:p>
         </w:tc>
@@ -16612,15 +15669,7 @@
         </w:rPr>
       </w:pPr>
       <w:r>
-        <w:t xml:space="preserve">This creates a unified employment interface across </w:t>
-      </w:r>
-      <w:proofErr w:type="spellStart"/>
-      <w:r>
-        <w:t>Meridion</w:t>
-      </w:r>
-      <w:proofErr w:type="spellEnd"/>
-      <w:r>
-        <w:t>: a DGA analyst, Faith Medical Group intake worker, Oryn Department of Finance clerk, Royal Historic Society archivist, Aureline City Library assistant, civic aide, or authorized field operative may sit at different desks in different institutions, but each is logging into a shared government-backed work network. The visible interface changes based on the player's job, permissions, active assignment, and current location, while the underlying authentication system remains the same.</w:t>
+        <w:t>This creates a unified employment interface across Meridion: a DGA analyst, Faith Medical Group intake worker, Oryn Department of Finance clerk, Royal Historic Society archivist, Aureline City Library assistant, civic aide, or authorized field operative may sit at different desks in different institutions, but each is logging into a shared government-backed work network. The visible interface changes based on the player's job, permissions, active assignment, and current location, while the underlying authentication system remains the same.</w:t>
       </w:r>
     </w:p>
     <w:p>
@@ -17181,19 +16230,11 @@
                 <w:rFonts w:ascii="Georgia" w:hAnsi="Georgia"/>
               </w:rPr>
             </w:pPr>
-            <w:proofErr w:type="gramStart"/>
-            <w:r>
-              <w:rPr>
-                <w:rFonts w:ascii="Georgia" w:hAnsi="Georgia"/>
-              </w:rPr>
-              <w:t>Counter Intelligence</w:t>
-            </w:r>
-            <w:proofErr w:type="gramEnd"/>
-            <w:r>
-              <w:rPr>
-                <w:rFonts w:ascii="Georgia" w:hAnsi="Georgia"/>
-              </w:rPr>
-              <w:t xml:space="preserve"> &amp; Internal Security (CIIS)</w:t>
+            <w:r>
+              <w:rPr>
+                <w:rFonts w:ascii="Georgia" w:hAnsi="Georgia"/>
+              </w:rPr>
+              <w:t>Counter Intelligence &amp; Internal Security (CIIS)</w:t>
             </w:r>
           </w:p>
         </w:tc>
@@ -17459,19 +16500,11 @@
                 <w:rFonts w:ascii="Georgia" w:hAnsi="Georgia"/>
               </w:rPr>
             </w:pPr>
-            <w:proofErr w:type="spellStart"/>
-            <w:r>
-              <w:rPr>
-                <w:rFonts w:ascii="Georgia" w:hAnsi="Georgia"/>
-              </w:rPr>
-              <w:t>Meridion</w:t>
-            </w:r>
-            <w:proofErr w:type="spellEnd"/>
-            <w:r>
-              <w:rPr>
-                <w:rFonts w:ascii="Georgia" w:hAnsi="Georgia"/>
-              </w:rPr>
-              <w:t xml:space="preserve"> Public Archives</w:t>
+            <w:r>
+              <w:rPr>
+                <w:rFonts w:ascii="Georgia" w:hAnsi="Georgia"/>
+              </w:rPr>
+              <w:t>Meridion Public Archives</w:t>
             </w:r>
           </w:p>
         </w:tc>
@@ -17859,15 +16892,7 @@
               <w:cnfStyle w:val="000000100000" w:firstRow="0" w:lastRow="0" w:firstColumn="0" w:lastColumn="0" w:oddVBand="0" w:evenVBand="0" w:oddHBand="1" w:evenHBand="0" w:firstRowFirstColumn="0" w:firstRowLastColumn="0" w:lastRowFirstColumn="0" w:lastRowLastColumn="0"/>
             </w:pPr>
             <w:r>
-              <w:t xml:space="preserve">Aureline City Library, </w:t>
-            </w:r>
-            <w:proofErr w:type="spellStart"/>
-            <w:r>
-              <w:t>Meridion</w:t>
-            </w:r>
-            <w:proofErr w:type="spellEnd"/>
-            <w:r>
-              <w:t xml:space="preserve"> Public Archives, Royal Historic Society</w:t>
+              <w:t>Aureline City Library, Meridion Public Archives, Royal Historic Society</w:t>
             </w:r>
           </w:p>
         </w:tc>
@@ -17994,15 +17019,7 @@
               <w:cnfStyle w:val="000000000000" w:firstRow="0" w:lastRow="0" w:firstColumn="0" w:lastColumn="0" w:oddVBand="0" w:evenVBand="0" w:oddHBand="0" w:evenHBand="0" w:firstRowFirstColumn="0" w:firstRowLastColumn="0" w:lastRowFirstColumn="0" w:lastRowLastColumn="0"/>
             </w:pPr>
             <w:r>
-              <w:t xml:space="preserve">Builds Intellect and Creativity, supports interface customization, hidden data routes, and </w:t>
-            </w:r>
-            <w:proofErr w:type="gramStart"/>
-            <w:r>
-              <w:t>systems</w:t>
-            </w:r>
-            <w:proofErr w:type="gramEnd"/>
-            <w:r>
-              <w:t>-based quests.</w:t>
+              <w:t>Builds Intellect and Creativity, supports interface customization, hidden data routes, and systems-based quests.</w:t>
             </w:r>
           </w:p>
         </w:tc>
@@ -18061,15 +17078,7 @@
               <w:cnfStyle w:val="000000100000" w:firstRow="0" w:lastRow="0" w:firstColumn="0" w:lastColumn="0" w:oddVBand="0" w:evenVBand="0" w:oddHBand="1" w:evenHBand="0" w:firstRowFirstColumn="0" w:firstRowLastColumn="0" w:lastRowFirstColumn="0" w:lastRowLastColumn="0"/>
             </w:pPr>
             <w:r>
-              <w:t xml:space="preserve">Requires communication </w:t>
-            </w:r>
-            <w:proofErr w:type="gramStart"/>
-            <w:r>
-              <w:t>skill</w:t>
-            </w:r>
-            <w:proofErr w:type="gramEnd"/>
-            <w:r>
-              <w:t>, reputation for reliability, and access to civic work postings or official internships.</w:t>
+              <w:t>Requires communication skill, reputation for reliability, and access to civic work postings or official internships.</w:t>
             </w:r>
           </w:p>
         </w:tc>
@@ -18082,13 +17091,8 @@
             <w:pPr>
               <w:cnfStyle w:val="000000100000" w:firstRow="0" w:lastRow="0" w:firstColumn="0" w:lastColumn="0" w:oddVBand="0" w:evenVBand="0" w:oddHBand="1" w:evenHBand="0" w:firstRowFirstColumn="0" w:firstRowLastColumn="0" w:lastRowFirstColumn="0" w:lastRowLastColumn="0"/>
             </w:pPr>
-            <w:proofErr w:type="gramStart"/>
-            <w:r>
-              <w:t>Builds</w:t>
-            </w:r>
-            <w:proofErr w:type="gramEnd"/>
-            <w:r>
-              <w:t xml:space="preserve"> Influence and Empathy, opens political quests, civic reputation events, and negotiation-based outcomes.</w:t>
+            <w:r>
+              <w:t>Builds Influence and Empathy, opens political quests, civic reputation events, and negotiation-based outcomes.</w:t>
             </w:r>
           </w:p>
         </w:tc>
@@ -18453,15 +17457,7 @@
               <w:cnfStyle w:val="000000000000" w:firstRow="0" w:lastRow="0" w:firstColumn="0" w:lastColumn="0" w:oddVBand="0" w:evenVBand="0" w:oddHBand="0" w:evenHBand="0" w:firstRowFirstColumn="0" w:firstRowLastColumn="0" w:lastRowFirstColumn="0" w:lastRowLastColumn="0"/>
             </w:pPr>
             <w:r>
-              <w:t xml:space="preserve">Requires clerical authorization, finance-system access, and reliability </w:t>
-            </w:r>
-            <w:proofErr w:type="gramStart"/>
-            <w:r>
-              <w:t>checks</w:t>
-            </w:r>
-            <w:proofErr w:type="gramEnd"/>
-            <w:r>
-              <w:t xml:space="preserve"> for sensitive records.</w:t>
+              <w:t>Requires clerical authorization, finance-system access, and reliability checks for sensitive records.</w:t>
             </w:r>
           </w:p>
         </w:tc>
@@ -18506,13 +17502,8 @@
             <w:pPr>
               <w:cnfStyle w:val="000000100000" w:firstRow="0" w:lastRow="0" w:firstColumn="0" w:lastColumn="0" w:oddVBand="0" w:evenVBand="0" w:oddHBand="1" w:evenHBand="0" w:firstRowFirstColumn="0" w:firstRowLastColumn="0" w:lastRowFirstColumn="0" w:lastRowLastColumn="0"/>
             </w:pPr>
-            <w:proofErr w:type="spellStart"/>
-            <w:r>
-              <w:t>Questnotice</w:t>
-            </w:r>
-            <w:proofErr w:type="spellEnd"/>
-            <w:r>
-              <w:t xml:space="preserve"> postings across Aureline and other sectors</w:t>
+            <w:r>
+              <w:t>Questnotice postings across Aureline and other sectors</w:t>
             </w:r>
           </w:p>
         </w:tc>
@@ -18574,10 +17565,7 @@
         </w:rPr>
       </w:pPr>
       <w:r>
-        <w:t>M</w:t>
-      </w:r>
-      <w:r>
-        <w:t xml:space="preserve">issions are objectives assigned by </w:t>
+        <w:t xml:space="preserve">Missions are objectives assigned by </w:t>
       </w:r>
       <w:r>
         <w:t>a</w:t>
@@ -18601,19 +17589,13 @@
         <w:t>CREDITS, skill growth, workplace</w:t>
       </w:r>
       <w:r>
-        <w:t xml:space="preserve"> reputation, </w:t>
-      </w:r>
-      <w:r>
-        <w:t xml:space="preserve">professional access, and specialized tools. Missions help players </w:t>
+        <w:t xml:space="preserve"> reputation, professional access, and specialized tools. Missions help players </w:t>
       </w:r>
       <w:r>
         <w:t>build experience</w:t>
       </w:r>
       <w:r>
-        <w:t xml:space="preserve"> and unlock new </w:t>
-      </w:r>
-      <w:r>
-        <w:t>opportunities</w:t>
+        <w:t xml:space="preserve"> and unlock new opportunities</w:t>
       </w:r>
       <w:r>
         <w:t xml:space="preserve"> without requiring fixed career tiers or faction alignment</w:t>
@@ -18910,33 +17892,11 @@
                 <w:rFonts w:ascii="Times New Roman" w:eastAsia="Times New Roman" w:hAnsi="Times New Roman" w:cs="Times New Roman"/>
               </w:rPr>
             </w:pPr>
-            <w:proofErr w:type="gramStart"/>
             <w:r>
               <w:rPr>
                 <w:rFonts w:ascii="Times New Roman" w:eastAsia="Times New Roman" w:hAnsi="Times New Roman" w:cs="Times New Roman"/>
               </w:rPr>
-              <w:t>Attend</w:t>
-            </w:r>
-            <w:proofErr w:type="gramEnd"/>
-            <w:r>
-              <w:rPr>
-                <w:rFonts w:ascii="Times New Roman" w:eastAsia="Times New Roman" w:hAnsi="Times New Roman" w:cs="Times New Roman"/>
-              </w:rPr>
-              <w:t xml:space="preserve"> workshops, earn certifications, </w:t>
-            </w:r>
-            <w:proofErr w:type="gramStart"/>
-            <w:r>
-              <w:rPr>
-                <w:rFonts w:ascii="Times New Roman" w:eastAsia="Times New Roman" w:hAnsi="Times New Roman" w:cs="Times New Roman"/>
-              </w:rPr>
-              <w:t>network</w:t>
-            </w:r>
-            <w:proofErr w:type="gramEnd"/>
-            <w:r>
-              <w:rPr>
-                <w:rFonts w:ascii="Times New Roman" w:eastAsia="Times New Roman" w:hAnsi="Times New Roman" w:cs="Times New Roman"/>
-              </w:rPr>
-              <w:t xml:space="preserve"> with colleagues, earn a promotion</w:t>
+              <w:t>Attend workshops, earn certifications, network with colleagues, earn a promotion</w:t>
             </w:r>
           </w:p>
         </w:tc>
@@ -19018,7 +17978,7 @@
           <w:rFonts w:ascii="Times New Roman" w:eastAsia="Times New Roman" w:hAnsi="Times New Roman" w:cs="Times New Roman"/>
         </w:rPr>
         <w:pict w14:anchorId="4BCBB4CC">
-          <v:rect id="_x0000_i1085" style="width:0;height:1.5pt" o:hralign="center" o:hrstd="t" o:hr="t" fillcolor="#a0a0a0" stroked="f"/>
+          <v:rect id="_x0000_i1026" style="width:0;height:1.5pt" o:hralign="center" o:hrstd="t" o:hr="t" fillcolor="#a0a0a0" stroked="f"/>
         </w:pict>
       </w:r>
     </w:p>
@@ -19127,19 +18087,7 @@
         <w:rPr>
           <w:rFonts w:ascii="Georgia" w:hAnsi="Georgia"/>
         </w:rPr>
-        <w:t xml:space="preserve">, housing evolves from a sparse starter apartment in </w:t>
-      </w:r>
-      <w:r>
-        <w:rPr>
-          <w:rFonts w:ascii="Georgia" w:hAnsi="Georgia"/>
-        </w:rPr>
-        <w:t>AURELINE</w:t>
-      </w:r>
-      <w:r>
-        <w:rPr>
-          <w:rFonts w:ascii="Georgia" w:hAnsi="Georgia"/>
-        </w:rPr>
-        <w:t xml:space="preserve"> to sprawling, world-recognized landmarks. The home reflects who the player is becoming, and NPCs notice.</w:t>
+        <w:t>, housing evolves from a sparse starter apartment in AURELINE to sprawling, world-recognized landmarks. The home reflects who the player is becoming, and NPCs notice.</w:t>
       </w:r>
     </w:p>
     <w:p>
@@ -19491,16 +18439,7 @@
                 <w:sz w:val="22"/>
                 <w:szCs w:val="22"/>
               </w:rPr>
-              <w:t>CREDITS</w:t>
-            </w:r>
-            <w:r>
-              <w:rPr>
-                <w:rFonts w:ascii="Georgia" w:eastAsia="Corbel" w:hAnsi="Georgia" w:cs="Corbel"/>
-                <w:color w:val="1A1A1A"/>
-                <w:sz w:val="22"/>
-                <w:szCs w:val="22"/>
-              </w:rPr>
-              <w:t xml:space="preserve"> earnings threshold</w:t>
+              <w:t>CREDITS earnings threshold</w:t>
             </w:r>
           </w:p>
         </w:tc>
@@ -19527,16 +18466,7 @@
                 <w:sz w:val="22"/>
                 <w:szCs w:val="22"/>
               </w:rPr>
-              <w:t>AURELINE</w:t>
-            </w:r>
-            <w:r>
-              <w:rPr>
-                <w:rFonts w:ascii="Georgia" w:eastAsia="Corbel" w:hAnsi="Georgia" w:cs="Corbel"/>
-                <w:color w:val="1A1A1A"/>
-                <w:sz w:val="22"/>
-                <w:szCs w:val="22"/>
-              </w:rPr>
-              <w:t>, THE GRID</w:t>
+              <w:t>AURELINE, THE GRID</w:t>
             </w:r>
           </w:p>
         </w:tc>
@@ -20159,19 +19089,8 @@
           <w:sz w:val="22"/>
           <w:szCs w:val="22"/>
         </w:rPr>
-        <w:t xml:space="preserve"> Quarterly. </w:t>
-      </w:r>
-      <w:proofErr w:type="gramStart"/>
-      <w:r>
-        <w:rPr>
-          <w:rFonts w:ascii="Georgia" w:eastAsia="Corbel" w:hAnsi="Georgia" w:cs="Corbel"/>
-          <w:color w:val="1A1A1A"/>
-          <w:sz w:val="22"/>
-          <w:szCs w:val="22"/>
-        </w:rPr>
-        <w:t>High-stakes</w:t>
-      </w:r>
-      <w:proofErr w:type="gramEnd"/>
+        <w:t xml:space="preserve"> Quarterly. High-stakes</w:t>
+      </w:r>
       <w:r>
         <w:rPr>
           <w:rFonts w:ascii="Georgia" w:eastAsia="Corbel" w:hAnsi="Georgia" w:cs="Corbel"/>
@@ -20663,7 +19582,7 @@
 </file>
 
 <file path=word/numbering.xml><?xml version="1.0" encoding="utf-8"?>
-<w:numbering xmlns:wpc="http://schemas.microsoft.com/office/word/2010/wordprocessingCanvas" xmlns:cx="http://schemas.microsoft.com/office/drawing/2014/chartex" xmlns:cx1="http://schemas.microsoft.com/office/drawing/2015/9/8/chartex" xmlns:cx2="http://schemas.microsoft.com/office/drawing/2015/10/21/chartex" xmlns:cx3="http://schemas.microsoft.com/office/drawing/2016/5/9/chartex" xmlns:cx4="http://schemas.microsoft.com/office/drawing/2016/5/10/chartex" xmlns:cx5="http://schemas.microsoft.com/office/drawing/2016/5/11/chartex" xmlns:cx6="http://schemas.microsoft.com/office/drawing/2016/5/12/chartex" xmlns:cx7="http://schemas.microsoft.com/office/drawing/2016/5/13/chartex" xmlns:cx8="http://schemas.microsoft.com/office/drawing/2016/5/14/chartex" xmlns:mc="http://schemas.openxmlformats.org/markup-compatibility/2006" xmlns:aink="http://schemas.microsoft.com/office/drawing/2016/ink" xmlns:am3d="http://schemas.microsoft.com/office/drawing/2017/model3d" xmlns:o="urn:schemas-microsoft-com:office:office" xmlns:oel="http://schemas.microsoft.com/office/2019/extlst" xmlns:r="http://schemas.openxmlformats.org/officeDocument/2006/relationships" xmlns:m="http://schemas.openxmlformats.org/officeDocument/2006/math" xmlns:v="urn:schemas-microsoft-com:vml" xmlns:wp14="http://schemas.microsoft.com/office/word/2010/wordprocessingDrawing" xmlns:wp="http://schemas.openxmlformats.org/drawingml/2006/wordprocessingDrawing" xmlns:w10="urn:schemas-microsoft-com:office:word" xmlns:w="http://schemas.openxmlformats.org/wordprocessingml/2006/main" xmlns:w14="http://schemas.microsoft.com/office/word/2010/wordml" xmlns:w15="http://schemas.microsoft.com/office/word/2012/wordml" xmlns:w16cei="http://schemas.microsoft.com/office/word/2026/wordml/cei" xmlns:w16cex="http://schemas.microsoft.com/office/word/2018/wordml/cex" xmlns:w16cid="http://schemas.microsoft.com/office/word/2016/wordml/cid" xmlns:w16="http://schemas.microsoft.com/office/word/2018/wordml" xmlns:w16du="http://schemas.microsoft.com/office/word/2023/wordml/word16du" xmlns:w16sdtdh="http://schemas.microsoft.com/office/word/2020/wordml/sdtdatahash" xmlns:w16sdtfl="http://schemas.microsoft.com/office/word/2024/wordml/sdtformatlock" xmlns:w16se="http://schemas.microsoft.com/office/word/2015/wordml/symex" xmlns:wpg="http://schemas.microsoft.com/office/word/2010/wordprocessingGroup" xmlns:wpi="http://schemas.microsoft.com/office/word/2010/wordprocessingInk" xmlns:wne="http://schemas.microsoft.com/office/word/2006/wordml" xmlns:wps="http://schemas.microsoft.com/office/word/2010/wordprocessingShape" mc:Ignorable="w14 w15 w16se w16cid w16 w16cex w16sdtdh w16sdtfl w16du wp14">
+<w:numbering xmlns:wpc="http://schemas.microsoft.com/office/word/2010/wordprocessingCanvas" xmlns:cx="http://schemas.microsoft.com/office/drawing/2014/chartex" xmlns:cx1="http://schemas.microsoft.com/office/drawing/2015/9/8/chartex" xmlns:cx2="http://schemas.microsoft.com/office/drawing/2015/10/21/chartex" xmlns:cx3="http://schemas.microsoft.com/office/drawing/2016/5/9/chartex" xmlns:cx4="http://schemas.microsoft.com/office/drawing/2016/5/10/chartex" xmlns:cx5="http://schemas.microsoft.com/office/drawing/2016/5/11/chartex" xmlns:cx6="http://schemas.microsoft.com/office/drawing/2016/5/12/chartex" xmlns:cx7="http://schemas.microsoft.com/office/drawing/2016/5/13/chartex" xmlns:cx8="http://schemas.microsoft.com/office/drawing/2016/5/14/chartex" xmlns:mc="http://schemas.openxmlformats.org/markup-compatibility/2006" xmlns:aink="http://schemas.microsoft.com/office/drawing/2016/ink" xmlns:am3d="http://schemas.microsoft.com/office/drawing/2017/model3d" xmlns:o="urn:schemas-microsoft-com:office:office" xmlns:oel="http://schemas.microsoft.com/office/2019/extlst" xmlns:r="http://schemas.openxmlformats.org/officeDocument/2006/relationships" xmlns:m="http://schemas.openxmlformats.org/officeDocument/2006/math" xmlns:v="urn:schemas-microsoft-com:vml" xmlns:wp14="http://schemas.microsoft.com/office/word/2010/wordprocessingDrawing" xmlns:wp="http://schemas.openxmlformats.org/drawingml/2006/wordprocessingDrawing" xmlns:w10="urn:schemas-microsoft-com:office:word" xmlns:w="http://schemas.openxmlformats.org/wordprocessingml/2006/main" xmlns:w14="http://schemas.microsoft.com/office/word/2010/wordml" xmlns:w15="http://schemas.microsoft.com/office/word/2012/wordml" xmlns:w16cex="http://schemas.microsoft.com/office/word/2018/wordml/cex" xmlns:w16cid="http://schemas.microsoft.com/office/word/2016/wordml/cid" xmlns:w16="http://schemas.microsoft.com/office/word/2018/wordml" xmlns:w16du="http://schemas.microsoft.com/office/word/2023/wordml/word16du" xmlns:w16sdtdh="http://schemas.microsoft.com/office/word/2020/wordml/sdtdatahash" xmlns:w16sdtfl="http://schemas.microsoft.com/office/word/2024/wordml/sdtformatlock" xmlns:w16se="http://schemas.microsoft.com/office/word/2015/wordml/symex" xmlns:wpg="http://schemas.microsoft.com/office/word/2010/wordprocessingGroup" xmlns:wpi="http://schemas.microsoft.com/office/word/2010/wordprocessingInk" xmlns:wne="http://schemas.microsoft.com/office/word/2006/wordml" xmlns:wps="http://schemas.microsoft.com/office/word/2010/wordprocessingShape" mc:Ignorable="w14 w15 w16se w16cid w16 w16cex w16sdtdh w16sdtfl w16du wp14">
   <w:abstractNum w:abstractNumId="0" w15:restartNumberingAfterBreak="0">
     <w:nsid w:val="0C28137A"/>
     <w:multiLevelType w:val="multilevel"/>
@@ -22141,6 +21060,7 @@
   <w:style w:type="character" w:default="1" w:styleId="DefaultParagraphFont">
     <w:name w:val="Default Paragraph Font"/>
     <w:uiPriority w:val="1"/>
+    <w:semiHidden/>
     <w:unhideWhenUsed/>
   </w:style>
   <w:style w:type="table" w:default="1" w:styleId="TableNormal">

</xml_diff>